<commit_message>
Researched continuous correlation models
</commit_message>
<xml_diff>
--- a/7-5 Summer Project.docx
+++ b/7-5 Summer Project.docx
@@ -3,16 +3,740 @@
 <w:document xmlns:wpc="http://schemas.microsoft.com/office/word/2010/wordprocessingCanvas" xmlns:cx="http://schemas.microsoft.com/office/drawing/2014/chartex" xmlns:cx1="http://schemas.microsoft.com/office/drawing/2015/9/8/chartex" xmlns:cx2="http://schemas.microsoft.com/office/drawing/2015/10/21/chartex" xmlns:cx3="http://schemas.microsoft.com/office/drawing/2016/5/9/chartex" xmlns:cx4="http://schemas.microsoft.com/office/drawing/2016/5/10/chartex" xmlns:cx5="http://schemas.microsoft.com/office/drawing/2016/5/11/chartex" xmlns:cx6="http://schemas.microsoft.com/office/drawing/2016/5/12/chartex" xmlns:cx7="http://schemas.microsoft.com/office/drawing/2016/5/13/chartex" xmlns:cx8="http://schemas.microsoft.com/office/drawing/2016/5/14/chartex" xmlns:mc="http://schemas.openxmlformats.org/markup-compatibility/2006" xmlns:aink="http://schemas.microsoft.com/office/drawing/2016/ink" xmlns:am3d="http://schemas.microsoft.com/office/drawing/2017/model3d" xmlns:o="urn:schemas-microsoft-com:office:office" xmlns:oel="http://schemas.microsoft.com/office/2019/extlst" xmlns:r="http://schemas.openxmlformats.org/officeDocument/2006/relationships" xmlns:m="http://schemas.openxmlformats.org/officeDocument/2006/math" xmlns:v="urn:schemas-microsoft-com:vml" xmlns:wp14="http://schemas.microsoft.com/office/word/2010/wordprocessingDrawing" xmlns:wp="http://schemas.openxmlformats.org/drawingml/2006/wordprocessingDrawing" xmlns:w10="urn:schemas-microsoft-com:office:word" xmlns:w="http://schemas.openxmlformats.org/wordprocessingml/2006/main" xmlns:w14="http://schemas.microsoft.com/office/word/2010/wordml" xmlns:w15="http://schemas.microsoft.com/office/word/2012/wordml" xmlns:w16cex="http://schemas.microsoft.com/office/word/2018/wordml/cex" xmlns:w16cid="http://schemas.microsoft.com/office/word/2016/wordml/cid" xmlns:w16="http://schemas.microsoft.com/office/word/2018/wordml" xmlns:w16du="http://schemas.microsoft.com/office/word/2023/wordml/word16du" xmlns:w16sdtdh="http://schemas.microsoft.com/office/word/2020/wordml/sdtdatahash" xmlns:w16se="http://schemas.microsoft.com/office/word/2015/wordml/symex" xmlns:wpg="http://schemas.microsoft.com/office/word/2010/wordprocessingGroup" xmlns:wpi="http://schemas.microsoft.com/office/word/2010/wordprocessingInk" xmlns:wne="http://schemas.microsoft.com/office/word/2006/wordml" xmlns:wps="http://schemas.microsoft.com/office/word/2010/wordprocessingShape" mc:Ignorable="w14 w15 w16se w16cid w16 w16cex w16sdtdh w16du wp14">
   <w:body>
     <w:p>
-      <w:pPr>
-        <w:rPr>
+      <w:r>
+        <w:t>Car dataset</w:t>
+      </w:r>
+      <w:r>
+        <w:t xml:space="preserve"> – pretty small but has continuous variables and predictors.</w:t>
+      </w:r>
+      <w:r>
+        <w:t xml:space="preserve"> </w:t>
+      </w:r>
+      <w:r>
+        <w:t>https://data.world/dataman-udit/cars-data</w:t>
+      </w:r>
+    </w:p>
+    <w:p>
+      <w:r>
+        <w:t>Target variable: price</w:t>
+      </w:r>
+    </w:p>
+    <w:p>
+      <w:r>
+        <w:t>Direct variables: mpg, cylinders, displacement, horsepower, weight, acceleration, model, origin</w:t>
+      </w:r>
+    </w:p>
+    <w:p>
+      <w:r>
+        <w:t xml:space="preserve">Indirect variables: </w:t>
+      </w:r>
+    </w:p>
+    <w:p>
+      <w:pPr>
+        <w:pStyle w:val="ListParagraph"/>
+        <w:numPr>
+          <w:ilvl w:val="0"/>
+          <w:numId w:val="13"/>
+        </w:numPr>
+      </w:pPr>
+      <w:r>
+        <w:t>Combinations of these variables (displacement / horsepower, mpg / weight, etc.)</w:t>
+      </w:r>
+    </w:p>
+    <w:p>
+      <w:pPr>
+        <w:pStyle w:val="ListParagraph"/>
+        <w:numPr>
+          <w:ilvl w:val="0"/>
+          <w:numId w:val="13"/>
+        </w:numPr>
+      </w:pPr>
+      <w:r>
+        <w:t>Whether the origin country produces a high or low number of cars</w:t>
+      </w:r>
+    </w:p>
+    <w:p>
+      <w:pPr>
+        <w:pStyle w:val="ListParagraph"/>
+        <w:numPr>
+          <w:ilvl w:val="0"/>
+          <w:numId w:val="13"/>
+        </w:numPr>
+      </w:pPr>
+      <w:r>
+        <w:t>Whether the model was produced before or after a certain year</w:t>
+      </w:r>
+    </w:p>
+    <w:p>
+      <w:r>
+        <w:t>GPT 4o:</w:t>
+      </w:r>
+    </w:p>
+    <w:p>
+      <w:pPr>
+        <w:spacing w:after="0" w:line="240" w:lineRule="auto"/>
+        <w:rPr>
+          <w:rFonts w:eastAsia="Times New Roman" w:cs="Times New Roman"/>
+          <w:kern w:val="0"/>
+          <w14:ligatures w14:val="none"/>
+        </w:rPr>
+      </w:pPr>
+      <w:r>
+        <w:rPr>
+          <w:rFonts w:eastAsia="Times New Roman" w:cs="Times New Roman"/>
           <w:b/>
           <w:bCs/>
-        </w:rPr>
-      </w:pPr>
-      <w:r>
-        <w:rPr>
+          <w:kern w:val="0"/>
+          <w14:ligatures w14:val="none"/>
+        </w:rPr>
+        <w:t>Power-to-Weight Ratio:</w:t>
+      </w:r>
+      <w:r>
+        <w:rPr>
+          <w:rFonts w:eastAsia="Times New Roman" w:cs="Times New Roman"/>
+          <w:kern w:val="0"/>
+          <w14:ligatures w14:val="none"/>
+        </w:rPr>
+        <w:t xml:space="preserve"> </w:t>
+      </w:r>
+      <w:r>
+        <w:rPr>
+          <w:rFonts w:eastAsia="Times New Roman" w:cs="Courier New"/>
+          <w:kern w:val="0"/>
+          <w14:ligatures w14:val="none"/>
+        </w:rPr>
+        <w:t>horsepower / weight</w:t>
+      </w:r>
+    </w:p>
+    <w:p>
+      <w:pPr>
+        <w:spacing w:after="0" w:line="240" w:lineRule="auto"/>
+        <w:rPr>
+          <w:rFonts w:eastAsia="Times New Roman" w:cs="Times New Roman"/>
+          <w:kern w:val="0"/>
+          <w14:ligatures w14:val="none"/>
+        </w:rPr>
+      </w:pPr>
+      <w:r>
+        <w:rPr>
+          <w:rFonts w:eastAsia="Times New Roman" w:cs="Times New Roman"/>
           <w:b/>
           <w:bCs/>
+          <w:kern w:val="0"/>
+          <w14:ligatures w14:val="none"/>
+        </w:rPr>
+        <w:t>Engine Efficiency:</w:t>
+      </w:r>
+      <w:r>
+        <w:rPr>
+          <w:rFonts w:eastAsia="Times New Roman" w:cs="Times New Roman"/>
+          <w:kern w:val="0"/>
+          <w14:ligatures w14:val="none"/>
+        </w:rPr>
+        <w:t xml:space="preserve"> </w:t>
+      </w:r>
+      <w:r>
+        <w:rPr>
+          <w:rFonts w:eastAsia="Times New Roman" w:cs="Courier New"/>
+          <w:kern w:val="0"/>
+          <w14:ligatures w14:val="none"/>
+        </w:rPr>
+        <w:t>displacement / horsepower</w:t>
+      </w:r>
+    </w:p>
+    <w:p>
+      <w:pPr>
+        <w:spacing w:after="0" w:line="240" w:lineRule="auto"/>
+        <w:rPr>
+          <w:rFonts w:eastAsia="Times New Roman" w:cs="Times New Roman"/>
+          <w:kern w:val="0"/>
+          <w14:ligatures w14:val="none"/>
+        </w:rPr>
+      </w:pPr>
+      <w:r>
+        <w:rPr>
+          <w:rFonts w:eastAsia="Times New Roman" w:cs="Times New Roman"/>
+          <w:b/>
+          <w:bCs/>
+          <w:kern w:val="0"/>
+          <w14:ligatures w14:val="none"/>
+        </w:rPr>
+        <w:t>Performance Index:</w:t>
+      </w:r>
+      <w:r>
+        <w:rPr>
+          <w:rFonts w:eastAsia="Times New Roman" w:cs="Times New Roman"/>
+          <w:kern w:val="0"/>
+          <w14:ligatures w14:val="none"/>
+        </w:rPr>
+        <w:t xml:space="preserve"> </w:t>
+      </w:r>
+      <w:r>
+        <w:rPr>
+          <w:rFonts w:eastAsia="Times New Roman" w:cs="Courier New"/>
+          <w:kern w:val="0"/>
+          <w14:ligatures w14:val="none"/>
+        </w:rPr>
+        <w:t>horsepower * acceleration</w:t>
+      </w:r>
+    </w:p>
+    <w:p>
+      <w:pPr>
+        <w:spacing w:after="0" w:line="240" w:lineRule="auto"/>
+        <w:rPr>
+          <w:rFonts w:eastAsia="Times New Roman" w:cs="Times New Roman"/>
+          <w:kern w:val="0"/>
+          <w14:ligatures w14:val="none"/>
+        </w:rPr>
+      </w:pPr>
+      <w:r>
+        <w:rPr>
+          <w:rFonts w:eastAsia="Times New Roman" w:cs="Times New Roman"/>
+          <w:b/>
+          <w:bCs/>
+          <w:kern w:val="0"/>
+          <w14:ligatures w14:val="none"/>
+        </w:rPr>
+        <w:t>Size-to-Weight Ratio:</w:t>
+      </w:r>
+      <w:r>
+        <w:rPr>
+          <w:rFonts w:eastAsia="Times New Roman" w:cs="Times New Roman"/>
+          <w:kern w:val="0"/>
+          <w14:ligatures w14:val="none"/>
+        </w:rPr>
+        <w:t xml:space="preserve"> </w:t>
+      </w:r>
+      <w:r>
+        <w:rPr>
+          <w:rFonts w:eastAsia="Times New Roman" w:cs="Courier New"/>
+          <w:kern w:val="0"/>
+          <w14:ligatures w14:val="none"/>
+        </w:rPr>
+        <w:t>displacement / weight</w:t>
+      </w:r>
+    </w:p>
+    <w:p>
+      <w:pPr>
+        <w:spacing w:after="0" w:line="240" w:lineRule="auto"/>
+        <w:rPr>
+          <w:rFonts w:eastAsia="Times New Roman" w:cs="Times New Roman"/>
+          <w:kern w:val="0"/>
+          <w14:ligatures w14:val="none"/>
+        </w:rPr>
+      </w:pPr>
+      <w:r>
+        <w:rPr>
+          <w:rFonts w:eastAsia="Times New Roman" w:cs="Times New Roman"/>
+          <w:b/>
+          <w:bCs/>
+          <w:kern w:val="0"/>
+          <w14:ligatures w14:val="none"/>
+        </w:rPr>
+        <w:t>Efficiency Index:</w:t>
+      </w:r>
+      <w:r>
+        <w:rPr>
+          <w:rFonts w:eastAsia="Times New Roman" w:cs="Times New Roman"/>
+          <w:kern w:val="0"/>
+          <w14:ligatures w14:val="none"/>
+        </w:rPr>
+        <w:t xml:space="preserve"> </w:t>
+      </w:r>
+      <w:r>
+        <w:rPr>
+          <w:rFonts w:eastAsia="Times New Roman" w:cs="Courier New"/>
+          <w:kern w:val="0"/>
+          <w14:ligatures w14:val="none"/>
+        </w:rPr>
+        <w:t>mpg * horsepower</w:t>
+      </w:r>
+    </w:p>
+    <w:p>
+      <w:pPr>
+        <w:spacing w:after="0" w:line="240" w:lineRule="auto"/>
+        <w:rPr>
+          <w:rFonts w:eastAsia="Times New Roman" w:cs="Times New Roman"/>
+          <w:kern w:val="0"/>
+          <w14:ligatures w14:val="none"/>
+        </w:rPr>
+      </w:pPr>
+      <w:r>
+        <w:rPr>
+          <w:rFonts w:eastAsia="Times New Roman" w:cs="Times New Roman"/>
+          <w:b/>
+          <w:bCs/>
+          <w:kern w:val="0"/>
+          <w14:ligatures w14:val="none"/>
+        </w:rPr>
+        <w:t>Cylinder-Weight Ratio:</w:t>
+      </w:r>
+      <w:r>
+        <w:rPr>
+          <w:rFonts w:eastAsia="Times New Roman" w:cs="Times New Roman"/>
+          <w:kern w:val="0"/>
+          <w14:ligatures w14:val="none"/>
+        </w:rPr>
+        <w:t xml:space="preserve"> </w:t>
+      </w:r>
+      <w:r>
+        <w:rPr>
+          <w:rFonts w:eastAsia="Times New Roman" w:cs="Courier New"/>
+          <w:kern w:val="0"/>
+          <w14:ligatures w14:val="none"/>
+        </w:rPr>
+        <w:t>cylinders / weight</w:t>
+      </w:r>
+    </w:p>
+    <w:p>
+      <w:pPr>
+        <w:rPr>
+          <w:rFonts w:eastAsia="Times New Roman" w:cs="Courier New"/>
+          <w:kern w:val="0"/>
+          <w14:ligatures w14:val="none"/>
+        </w:rPr>
+      </w:pPr>
+      <w:r>
+        <w:rPr>
+          <w:rFonts w:eastAsia="Times New Roman" w:cs="Times New Roman"/>
+          <w:b/>
+          <w:bCs/>
+          <w:kern w:val="0"/>
+          <w14:ligatures w14:val="none"/>
+        </w:rPr>
+        <w:t>Acceleration Index:</w:t>
+      </w:r>
+      <w:r>
+        <w:rPr>
+          <w:rFonts w:eastAsia="Times New Roman" w:cs="Times New Roman"/>
+          <w:kern w:val="0"/>
+          <w14:ligatures w14:val="none"/>
+        </w:rPr>
+        <w:t xml:space="preserve"> </w:t>
+      </w:r>
+      <w:r>
+        <w:rPr>
+          <w:rFonts w:eastAsia="Times New Roman" w:cs="Courier New"/>
+          <w:kern w:val="0"/>
+          <w14:ligatures w14:val="none"/>
+        </w:rPr>
+        <w:t>acceleration / weight</w:t>
+      </w:r>
+    </w:p>
+    <w:p>
+      <w:pPr>
+        <w:rPr>
+          <w:rFonts w:eastAsia="Times New Roman" w:cs="Courier New"/>
+          <w:kern w:val="0"/>
+          <w14:ligatures w14:val="none"/>
+        </w:rPr>
+      </w:pPr>
+      <w:r>
+        <w:rPr>
+          <w:rFonts w:eastAsia="Times New Roman" w:cs="Courier New"/>
+          <w:kern w:val="0"/>
+          <w14:ligatures w14:val="none"/>
+        </w:rPr>
+        <w:t>GLOBE dataset – has many social characteristics of countries on a continuous scale that we can use to predict GDP.</w:t>
+      </w:r>
+    </w:p>
+    <w:p>
+      <w:pPr>
+        <w:rPr>
+          <w:rFonts w:eastAsia="Times New Roman" w:cs="Courier New"/>
+          <w:kern w:val="0"/>
+          <w14:ligatures w14:val="none"/>
+        </w:rPr>
+      </w:pPr>
+      <w:r>
+        <w:rPr>
+          <w:rFonts w:eastAsia="Times New Roman" w:cs="Courier New"/>
+          <w:kern w:val="0"/>
+          <w14:ligatures w14:val="none"/>
+        </w:rPr>
+        <w:t>https://globeproject.com/study_2004_2007%3Fpage_id=data.html#findings</w:t>
+      </w:r>
+    </w:p>
+    <w:p>
+      <w:r>
+        <w:t>Target variable: GDP</w:t>
+      </w:r>
+    </w:p>
+    <w:p>
+      <w:r>
+        <w:t>Direct variables: How much the country values… charismatic leadership, team-oriented leadership, participative leadership, humane-oriented leadership, autonomous leadership, self-protective leadership, performance orientation, assertiveness, future orientation, humane orientation, institutional collectivism, in-group collectivism, gender egalitarianism, power distance, uncertainty avoidance</w:t>
+      </w:r>
+    </w:p>
+    <w:p>
+      <w:r>
+        <w:t>Indirect variables:</w:t>
+      </w:r>
+    </w:p>
+    <w:p>
+      <w:pPr>
+        <w:pStyle w:val="ListParagraph"/>
+        <w:numPr>
+          <w:ilvl w:val="0"/>
+          <w:numId w:val="13"/>
+        </w:numPr>
+      </w:pPr>
+      <w:r>
+        <w:t>Create multiplicative indices</w:t>
+      </w:r>
+      <w:r>
+        <w:t xml:space="preserve"> for:</w:t>
+      </w:r>
+    </w:p>
+    <w:p>
+      <w:pPr>
+        <w:pStyle w:val="ListParagraph"/>
+        <w:numPr>
+          <w:ilvl w:val="1"/>
+          <w:numId w:val="13"/>
+        </w:numPr>
+      </w:pPr>
+      <w:r>
+        <w:t>C</w:t>
+      </w:r>
+      <w:r>
+        <w:t>ollectivism vs. autonomous orientations (team-oriented leadership * participative leadership * institutional collectivism), (autonomous leadership * performance orientation * assertiveness)</w:t>
+      </w:r>
+    </w:p>
+    <w:p>
+      <w:pPr>
+        <w:pStyle w:val="ListParagraph"/>
+        <w:numPr>
+          <w:ilvl w:val="1"/>
+          <w:numId w:val="13"/>
+        </w:numPr>
+      </w:pPr>
+      <w:r>
+        <w:t>E</w:t>
+      </w:r>
+      <w:r>
+        <w:t xml:space="preserve">galitarianism vs. </w:t>
+      </w:r>
+      <w:r>
+        <w:t>individualism on a societal level</w:t>
+      </w:r>
+    </w:p>
+    <w:p>
+      <w:pPr>
+        <w:pStyle w:val="ListParagraph"/>
+        <w:numPr>
+          <w:ilvl w:val="1"/>
+          <w:numId w:val="13"/>
+        </w:numPr>
+      </w:pPr>
+      <w:r>
+        <w:t>Individual traits (i.e. charisma) vs. collective traits</w:t>
+      </w:r>
+    </w:p>
+    <w:p>
+      <w:pPr>
+        <w:pStyle w:val="ListParagraph"/>
+        <w:numPr>
+          <w:ilvl w:val="1"/>
+          <w:numId w:val="13"/>
+        </w:numPr>
+      </w:pPr>
+      <w:r>
+        <w:t>Protectiveness vs. future orientation</w:t>
+      </w:r>
+    </w:p>
+    <w:p>
+      <w:r>
+        <w:t>GPT 4o:</w:t>
+      </w:r>
+    </w:p>
+    <w:p>
+      <w:pPr>
+        <w:pStyle w:val="ListParagraph"/>
+        <w:numPr>
+          <w:ilvl w:val="0"/>
+          <w:numId w:val="13"/>
+        </w:numPr>
+      </w:pPr>
+      <w:r>
+        <w:t xml:space="preserve">Sum of leadership values </w:t>
+      </w:r>
+    </w:p>
+    <w:p>
+      <w:pPr>
+        <w:pStyle w:val="ListParagraph"/>
+        <w:numPr>
+          <w:ilvl w:val="0"/>
+          <w:numId w:val="13"/>
+        </w:numPr>
+      </w:pPr>
+      <w:r>
+        <w:t>Index representing progressive cultural values: gender egalitarianism, future orientation, institutional collectivism</w:t>
+      </w:r>
+    </w:p>
+    <w:p>
+      <w:pPr>
+        <w:pStyle w:val="ListParagraph"/>
+        <w:numPr>
+          <w:ilvl w:val="0"/>
+          <w:numId w:val="13"/>
+        </w:numPr>
+      </w:pPr>
+      <w:r>
+        <w:lastRenderedPageBreak/>
+        <w:t>Economic stability index: uncertainty avoidance, power distance, self-protective leadership</w:t>
+      </w:r>
+    </w:p>
+    <w:p>
+      <w:pPr>
+        <w:pStyle w:val="ListParagraph"/>
+        <w:numPr>
+          <w:ilvl w:val="0"/>
+          <w:numId w:val="13"/>
+        </w:numPr>
+      </w:pPr>
+      <w:r>
+        <w:t>Innovative potential index: performance orientation, assertiveness, autonomous leadership</w:t>
+      </w:r>
+    </w:p>
+    <w:p>
+      <w:pPr>
+        <w:pStyle w:val="ListParagraph"/>
+        <w:numPr>
+          <w:ilvl w:val="0"/>
+          <w:numId w:val="13"/>
+        </w:numPr>
+      </w:pPr>
+      <w:r>
+        <w:t>Social cohesion index: humane orientation, institutional collectivism, in-group collectivism</w:t>
+      </w:r>
+    </w:p>
+    <w:p>
+      <w:pPr>
+        <w:pStyle w:val="ListParagraph"/>
+        <w:numPr>
+          <w:ilvl w:val="0"/>
+          <w:numId w:val="13"/>
+        </w:numPr>
+      </w:pPr>
+      <w:r>
+        <w:t>Cultural adaptability index: future orientation, uncertainty avoidance, institutional collectivism</w:t>
+      </w:r>
+    </w:p>
+    <w:p>
+      <w:r>
+        <w:t>--- NOTE: three types of regression tasks: continuous outcome, categorical outcome, ordinal outcome ---</w:t>
+      </w:r>
+    </w:p>
+    <w:p>
+      <w:r>
+        <w:t>Airbnb dataset has many different cities (I picked Albany) – these are the columns after I joined two datasets on their ‘id’ and only selected the columns with float/int values. (Not all of these are meaningful continuous variables but just to give a sense.) I can also add in binary categorical variables as they do not require any preprocessing to include in regression models.</w:t>
+      </w:r>
+      <w:r>
+        <w:t xml:space="preserve"> </w:t>
+      </w:r>
+    </w:p>
+    <w:p>
+      <w:r>
+        <w:t xml:space="preserve">Some of the variables (rating) are ordinal. However, this </w:t>
+      </w:r>
+      <w:hyperlink r:id="rId5" w:history="1">
+        <w:r>
+          <w:rPr>
+            <w:rStyle w:val="Hyperlink"/>
+          </w:rPr>
+          <w:t>professor</w:t>
+        </w:r>
+      </w:hyperlink>
+      <w:r>
+        <w:t xml:space="preserve"> argues that treating ordinal variables as continuous in practice does not often lead to significant issues. Alternatively, ratings could be binned as integers and treated as categorical variables.  </w:t>
+      </w:r>
+    </w:p>
+    <w:p>
+      <w:r>
+        <w:rPr>
+          <w:noProof/>
+        </w:rPr>
+        <w:drawing>
+          <wp:inline distT="0" distB="0" distL="0" distR="0" wp14:anchorId="46B9526E" wp14:editId="4386A366">
+            <wp:extent cx="5943600" cy="2663825"/>
+            <wp:effectExtent l="0" t="0" r="0" b="3175"/>
+            <wp:docPr id="343323262" name="Picture 1" descr="A computer screen shot of white text&#10;&#10;Description automatically generated"/>
+            <wp:cNvGraphicFramePr>
+              <a:graphicFrameLocks xmlns:a="http://schemas.openxmlformats.org/drawingml/2006/main" noChangeAspect="1"/>
+            </wp:cNvGraphicFramePr>
+            <a:graphic xmlns:a="http://schemas.openxmlformats.org/drawingml/2006/main">
+              <a:graphicData uri="http://schemas.openxmlformats.org/drawingml/2006/picture">
+                <pic:pic xmlns:pic="http://schemas.openxmlformats.org/drawingml/2006/picture">
+                  <pic:nvPicPr>
+                    <pic:cNvPr id="343323262" name="Picture 1" descr="A computer screen shot of white text&#10;&#10;Description automatically generated"/>
+                    <pic:cNvPicPr/>
+                  </pic:nvPicPr>
+                  <pic:blipFill>
+                    <a:blip r:embed="rId6"/>
+                    <a:stretch>
+                      <a:fillRect/>
+                    </a:stretch>
+                  </pic:blipFill>
+                  <pic:spPr>
+                    <a:xfrm>
+                      <a:off x="0" y="0"/>
+                      <a:ext cx="5943600" cy="2663825"/>
+                    </a:xfrm>
+                    <a:prstGeom prst="rect">
+                      <a:avLst/>
+                    </a:prstGeom>
+                  </pic:spPr>
+                </pic:pic>
+              </a:graphicData>
+            </a:graphic>
+          </wp:inline>
+        </w:drawing>
+      </w:r>
+    </w:p>
+    <w:p>
+      <w:r>
+        <w:rPr>
+          <w:b/>
+          <w:bCs/>
+        </w:rPr>
+        <w:t>Target variable</w:t>
+      </w:r>
+      <w:r>
+        <w:t>: adjusted_price</w:t>
+      </w:r>
+    </w:p>
+    <w:p>
+      <w:r>
+        <w:rPr>
+          <w:b/>
+          <w:bCs/>
+        </w:rPr>
+        <w:t xml:space="preserve">Direct variables: </w:t>
+      </w:r>
+      <w:r>
+        <w:t>All of the columns</w:t>
+      </w:r>
+    </w:p>
+    <w:p>
+      <w:pPr>
+        <w:rPr>
+          <w:b/>
+          <w:bCs/>
+        </w:rPr>
+      </w:pPr>
+      <w:r>
+        <w:rPr>
+          <w:b/>
+          <w:bCs/>
+        </w:rPr>
+        <w:t xml:space="preserve">Indirect variables: </w:t>
+      </w:r>
+    </w:p>
+    <w:p>
+      <w:r>
+        <w:t>Combinations of review scores (cleanliness + location / 2 for example)</w:t>
+      </w:r>
+    </w:p>
+    <w:p>
+      <w:r>
+        <w:t>Rating per review</w:t>
+      </w:r>
+    </w:p>
+    <w:p>
+      <w:r>
+        <w:t>Difference between minimum and maximum nights, difference between minimum minimum and maximum maximum nights</w:t>
+      </w:r>
+    </w:p>
+    <w:p>
+      <w:r>
+        <w:t>Ratings of other houses owned by the host</w:t>
+      </w:r>
+    </w:p>
+    <w:p>
+      <w:r>
+        <w:t>Availability of other houses owned by the host</w:t>
+      </w:r>
+    </w:p>
+    <w:p>
+      <w:r>
+        <w:lastRenderedPageBreak/>
+        <w:t>Size (bathrooms + beds) of other houses owned by the host</w:t>
+      </w:r>
+    </w:p>
+    <w:p>
+      <w:pPr>
+        <w:rPr>
+          <w:i/>
+          <w:iCs/>
+        </w:rPr>
+      </w:pPr>
+      <w:r>
+        <w:rPr>
+          <w:i/>
+          <w:iCs/>
+        </w:rPr>
+        <w:t>GPT 4o ideas:</w:t>
+      </w:r>
+    </w:p>
+    <w:p>
+      <w:pPr>
+        <w:pStyle w:val="ListParagraph"/>
+        <w:numPr>
+          <w:ilvl w:val="0"/>
+          <w:numId w:val="10"/>
+        </w:numPr>
+      </w:pPr>
+      <w:r>
+        <w:t>Host experience (binary variable whether host has multiple listings)</w:t>
+      </w:r>
+    </w:p>
+    <w:p>
+      <w:pPr>
+        <w:pStyle w:val="ListParagraph"/>
+        <w:numPr>
+          <w:ilvl w:val="0"/>
+          <w:numId w:val="10"/>
+        </w:numPr>
+      </w:pPr>
+      <w:r>
+        <w:t>Review scores average</w:t>
+      </w:r>
+    </w:p>
+    <w:p>
+      <w:pPr>
+        <w:pStyle w:val="ListParagraph"/>
+        <w:numPr>
+          <w:ilvl w:val="0"/>
+          <w:numId w:val="10"/>
+        </w:numPr>
+      </w:pPr>
+      <w:r>
+        <w:t>Availability ratios over different periods (availability_30 / availability_365)</w:t>
+      </w:r>
+    </w:p>
+    <w:p>
+      <w:pPr>
+        <w:pStyle w:val="ListParagraph"/>
+        <w:numPr>
+          <w:ilvl w:val="0"/>
+          <w:numId w:val="10"/>
+        </w:numPr>
+      </w:pPr>
+      <w:r>
+        <w:t>Accommodates_per_bathroom, accommodates_per_bedroom</w:t>
+      </w:r>
+    </w:p>
+    <w:p>
+      <w:pPr>
+        <w:rPr>
+          <w:b/>
+          <w:bCs/>
+        </w:rPr>
+      </w:pPr>
+      <w:r>
+        <w:rPr>
+          <w:b/>
+          <w:bCs/>
         </w:rPr>
         <w:t>Continuous predictors, continuous target:</w:t>
       </w:r>
@@ -29,6 +753,9 @@
     </w:p>
     <w:p>
       <w:r>
+        <w:rPr>
+          <w:noProof/>
+        </w:rPr>
         <w:drawing>
           <wp:inline distT="0" distB="0" distL="0" distR="0" wp14:anchorId="71D1E009" wp14:editId="4530A5DE">
             <wp:extent cx="5626389" cy="3048157"/>
@@ -45,7 +772,7 @@
                     <pic:cNvPicPr/>
                   </pic:nvPicPr>
                   <pic:blipFill>
-                    <a:blip r:embed="rId5"/>
+                    <a:blip r:embed="rId7"/>
                     <a:stretch>
                       <a:fillRect/>
                     </a:stretch>
@@ -68,15 +795,7 @@
     </w:p>
     <w:p>
       <w:r>
-        <w:t xml:space="preserve">Then, I ran VIF to eliminate the multicollinear variables as they would influence the coefficients of the regression model. Because of this, some of the variables that were highly correlated to the target in the previous analysis </w:t>
-      </w:r>
-      <w:proofErr w:type="gramStart"/>
-      <w:r>
-        <w:t>were dropped</w:t>
-      </w:r>
-      <w:proofErr w:type="gramEnd"/>
-      <w:r>
-        <w:t xml:space="preserve"> as they were highly correlated to other variables in the predictors. I wrote code to automatically drop variables if their VIF was greater than 10 but depending on the situation, variables should not be dropped if the user thinks they might be relevant to the model.</w:t>
+        <w:t>Then, I ran VIF to eliminate the multicollinear variables as they would influence the coefficients of the regression model. Because of this, some of the variables that were highly correlated to the target in the previous analysis were dropped as they were highly correlated to other variables in the predictors. I wrote code to automatically drop variables if their VIF was greater than 10 but depending on the situation, variables should not be dropped if the user thinks they might be relevant to the model.</w:t>
       </w:r>
     </w:p>
     <w:p>
@@ -86,6 +805,10 @@
     </w:p>
     <w:p>
       <w:r>
+        <w:rPr>
+          <w:noProof/>
+        </w:rPr>
+        <w:lastRenderedPageBreak/>
         <w:drawing>
           <wp:inline distT="0" distB="0" distL="0" distR="0" wp14:anchorId="58EB71F3" wp14:editId="355110F4">
             <wp:extent cx="5943600" cy="2022475"/>
@@ -102,7 +825,7 @@
                     <pic:cNvPicPr/>
                   </pic:nvPicPr>
                   <pic:blipFill>
-                    <a:blip r:embed="rId6"/>
+                    <a:blip r:embed="rId8"/>
                     <a:stretch>
                       <a:fillRect/>
                     </a:stretch>
@@ -130,7 +853,9 @@
     </w:p>
     <w:p>
       <w:r>
-        <w:lastRenderedPageBreak/>
+        <w:rPr>
+          <w:noProof/>
+        </w:rPr>
         <w:drawing>
           <wp:inline distT="0" distB="0" distL="0" distR="0" wp14:anchorId="4FCA2BA4" wp14:editId="75AAFEDE">
             <wp:extent cx="5943600" cy="2129155"/>
@@ -147,7 +872,7 @@
                     <pic:cNvPicPr/>
                   </pic:nvPicPr>
                   <pic:blipFill>
-                    <a:blip r:embed="rId7"/>
+                    <a:blip r:embed="rId9"/>
                     <a:stretch>
                       <a:fillRect/>
                     </a:stretch>
@@ -170,32 +895,20 @@
     </w:p>
     <w:p>
       <w:r>
-        <w:t xml:space="preserve">Another follow-up one could do is to select the best features for the model, and there are a couple of different ways to do this (forward steps, backward steps, AIC). I have an implementation of AIC in my code, but it’s very slow. This could also be a spot for </w:t>
-      </w:r>
-      <w:proofErr w:type="gramStart"/>
-      <w:r>
-        <w:t>human</w:t>
-      </w:r>
-      <w:proofErr w:type="gramEnd"/>
-      <w:r>
-        <w:t xml:space="preserve"> in the loop. </w:t>
-      </w:r>
-    </w:p>
-    <w:p>
-      <w:r>
-        <w:t xml:space="preserve">AIC example for 2015 data – only two features are </w:t>
-      </w:r>
-      <w:proofErr w:type="gramStart"/>
-      <w:r>
-        <w:t>actually needed</w:t>
-      </w:r>
-      <w:proofErr w:type="gramEnd"/>
-      <w:r>
-        <w:t xml:space="preserve"> to do an accurate prediction:</w:t>
-      </w:r>
-    </w:p>
-    <w:p>
-      <w:r>
+        <w:t xml:space="preserve">Another follow-up one could do is to select the best features for the model, and there are a couple of different ways to do this (forward steps, backward steps, AIC). I have an implementation of AIC in my code, but it’s very slow. This could also be a spot for human in the loop. </w:t>
+      </w:r>
+    </w:p>
+    <w:p>
+      <w:r>
+        <w:t>AIC example for 2015 data – only two features are actually needed to do an accurate prediction:</w:t>
+      </w:r>
+    </w:p>
+    <w:p>
+      <w:r>
+        <w:rPr>
+          <w:noProof/>
+        </w:rPr>
+        <w:lastRenderedPageBreak/>
         <w:drawing>
           <wp:inline distT="0" distB="0" distL="0" distR="0" wp14:anchorId="0EC0166E" wp14:editId="5481D054">
             <wp:extent cx="5943600" cy="2670810"/>
@@ -212,7 +925,7 @@
                     <pic:cNvPicPr/>
                   </pic:nvPicPr>
                   <pic:blipFill>
-                    <a:blip r:embed="rId8"/>
+                    <a:blip r:embed="rId10"/>
                     <a:stretch>
                       <a:fillRect/>
                     </a:stretch>
@@ -255,7 +968,10 @@
     </w:p>
     <w:p>
       <w:r>
-        <w:t>Because most of the predictors had different units, it was hard for me to think of meaningful combinations of variables… GPT came up with some indices that were basically combinations of related variables:</w:t>
+        <w:t>Because most of the predictors had different units, it was hard for me to think of meaningful combinations of variables</w:t>
+      </w:r>
+      <w:r>
+        <w:t>:</w:t>
       </w:r>
     </w:p>
     <w:p>
@@ -270,7 +986,6 @@
     </w:p>
     <w:p>
       <w:r>
-        <w:lastRenderedPageBreak/>
         <w:t>------------- GPT 4o -------------------</w:t>
       </w:r>
     </w:p>
@@ -293,24 +1008,17 @@
         </w:rPr>
         <w:t>Health Expenditure per Capita = Current health expenditure (% of GDP) / Population mid-year estimates (millions)</w:t>
       </w:r>
-    </w:p>
-    <w:p>
-      <w:r>
-        <w:t xml:space="preserve">Education and Workforce Index = (Gross enrollment ratio - Primary (female) + Gross enrollment ratio - Primary (male) + Gross enrollment ratio - Lower secondary level (female) + Gross enrollment ratio - Lower secondary level (male) + Gross enrollment ratio - Upper secondary level (female) + Gross enrollment ratio - Upper secondary level (male)) / </w:t>
-      </w:r>
-      <w:proofErr w:type="spellStart"/>
-      <w:r>
-        <w:t>Labour</w:t>
-      </w:r>
-      <w:proofErr w:type="spellEnd"/>
-      <w:r>
-        <w:t xml:space="preserve"> force participation </w:t>
-      </w:r>
-      <w:r>
-        <w:t>–</w:t>
-      </w:r>
-      <w:r>
-        <w:t xml:space="preserve"> Total</w:t>
+      <w:r>
+        <w:rPr>
+          <w:i/>
+          <w:iCs/>
+        </w:rPr>
+        <w:t xml:space="preserve"> *doesn’t make sense given the units</w:t>
+      </w:r>
+    </w:p>
+    <w:p>
+      <w:r>
+        <w:t>Education and Workforce Index = (Gross enrollment ratio - Primary (female) + Gross enrollment ratio - Primary (male) + Gross enrollment ratio - Lower secondary level (female) + Gross enrollment ratio - Lower secondary level (male) + Gross enrollment ratio - Upper secondary level (female) + Gross enrollment ratio - Upper secondary level (male)) / Labour force participation – Total</w:t>
       </w:r>
     </w:p>
     <w:p>
@@ -325,20 +1033,13 @@
     </w:p>
     <w:p>
       <w:r>
+        <w:lastRenderedPageBreak/>
         <w:t>Migration Employment Impact = (International migrant stock: Both sexes (% total population) + Employment by industry: Agriculture (%) Male and Female + Employment by industry: Industry (%) Male and Female + Employment by industry: Services (%) Male and Female) / 4</w:t>
       </w:r>
     </w:p>
     <w:p>
       <w:r>
-        <w:t xml:space="preserve">Gender Equality Index = (Seats held by women in national parliament, as of February (%) + </w:t>
-      </w:r>
-      <w:proofErr w:type="spellStart"/>
-      <w:r>
-        <w:t>Labour</w:t>
-      </w:r>
-      <w:proofErr w:type="spellEnd"/>
-      <w:r>
-        <w:t xml:space="preserve"> force participation - Female) / 2</w:t>
+        <w:t>Gender Equality Index = (Seats held by women in national parliament, as of February (%) + Labour force participation - Female) / 2</w:t>
       </w:r>
     </w:p>
     <w:p/>
@@ -354,6 +1055,9 @@
     </w:p>
     <w:p>
       <w:r>
+        <w:rPr>
+          <w:noProof/>
+        </w:rPr>
         <w:drawing>
           <wp:inline distT="0" distB="0" distL="0" distR="0" wp14:anchorId="5D077C57" wp14:editId="438FE10A">
             <wp:extent cx="5943600" cy="1964055"/>
@@ -370,7 +1074,7 @@
                     <pic:cNvPicPr/>
                   </pic:nvPicPr>
                   <pic:blipFill>
-                    <a:blip r:embed="rId9"/>
+                    <a:blip r:embed="rId11"/>
                     <a:stretch>
                       <a:fillRect/>
                     </a:stretch>
@@ -398,7 +1102,9 @@
     </w:p>
     <w:p>
       <w:r>
-        <w:lastRenderedPageBreak/>
+        <w:rPr>
+          <w:noProof/>
+        </w:rPr>
         <w:drawing>
           <wp:inline distT="0" distB="0" distL="0" distR="0" wp14:anchorId="158A27B6" wp14:editId="41E54FF3">
             <wp:extent cx="5943600" cy="2136775"/>
@@ -415,7 +1121,7 @@
                     <pic:cNvPicPr/>
                   </pic:nvPicPr>
                   <pic:blipFill>
-                    <a:blip r:embed="rId10"/>
+                    <a:blip r:embed="rId12"/>
                     <a:stretch>
                       <a:fillRect/>
                     </a:stretch>
@@ -438,24 +1144,26 @@
     </w:p>
     <w:p>
       <w:r>
-        <w:t>Because GDP in constant 2015 prices was such a high predictor, I tried dropping it just to explore what would happen in a more balanced dataset. Individual correlations were of course the same.</w:t>
-      </w:r>
-    </w:p>
-    <w:p>
-      <w:r>
-        <w:t xml:space="preserve">Does </w:t>
-      </w:r>
-      <w:proofErr w:type="gramStart"/>
-      <w:r>
-        <w:t>pretty well</w:t>
-      </w:r>
-      <w:proofErr w:type="gramEnd"/>
-      <w:r>
-        <w:t xml:space="preserve"> at predicting in 2015 (based on adjusted R^2).</w:t>
-      </w:r>
-    </w:p>
-    <w:p>
-      <w:r>
+        <w:t>Because GDP in constant 2015 prices was such a high predictor, I tried dropping it just to explore what would happen in a more balanced dataset. Individual correlations were of course the same</w:t>
+      </w:r>
+      <w:r>
+        <w:t xml:space="preserve"> (but without GDP)</w:t>
+      </w:r>
+      <w:r>
+        <w:t>.</w:t>
+      </w:r>
+    </w:p>
+    <w:p>
+      <w:r>
+        <w:t>Does pretty well at predicting in 2015 (based on adjusted R^2).</w:t>
+      </w:r>
+    </w:p>
+    <w:p>
+      <w:r>
+        <w:rPr>
+          <w:noProof/>
+        </w:rPr>
+        <w:lastRenderedPageBreak/>
         <w:drawing>
           <wp:inline distT="0" distB="0" distL="0" distR="0" wp14:anchorId="0843EAE4" wp14:editId="1EFA7ABA">
             <wp:extent cx="5943600" cy="1413510"/>
@@ -472,7 +1180,7 @@
                     <pic:cNvPicPr/>
                   </pic:nvPicPr>
                   <pic:blipFill>
-                    <a:blip r:embed="rId11"/>
+                    <a:blip r:embed="rId13"/>
                     <a:stretch>
                       <a:fillRect/>
                     </a:stretch>
@@ -495,6 +1203,9 @@
     </w:p>
     <w:p>
       <w:r>
+        <w:rPr>
+          <w:noProof/>
+        </w:rPr>
         <w:drawing>
           <wp:inline distT="0" distB="0" distL="0" distR="0" wp14:anchorId="3EAC5DB3" wp14:editId="6982D7BB">
             <wp:extent cx="5943600" cy="1503045"/>
@@ -511,7 +1222,7 @@
                     <pic:cNvPicPr/>
                   </pic:nvPicPr>
                   <pic:blipFill>
-                    <a:blip r:embed="rId12"/>
+                    <a:blip r:embed="rId14"/>
                     <a:stretch>
                       <a:fillRect/>
                     </a:stretch>
@@ -534,19 +1245,14 @@
     </w:p>
     <w:p>
       <w:r>
-        <w:t xml:space="preserve">But significantly worse for 2010 – perhaps the underlying structure is </w:t>
-      </w:r>
-      <w:proofErr w:type="gramStart"/>
-      <w:r>
-        <w:t>nonlinear</w:t>
-      </w:r>
-      <w:proofErr w:type="gramEnd"/>
-      <w:r>
-        <w:t xml:space="preserve"> or the predictors are not the best for this year.</w:t>
-      </w:r>
-    </w:p>
-    <w:p>
-      <w:r>
+        <w:t>But significantly worse for 2010 – perhaps the underlying structure is nonlinear or the predictors are not the best for this year.</w:t>
+      </w:r>
+    </w:p>
+    <w:p>
+      <w:r>
+        <w:rPr>
+          <w:noProof/>
+        </w:rPr>
         <w:drawing>
           <wp:inline distT="0" distB="0" distL="0" distR="0" wp14:anchorId="6901B328" wp14:editId="0E39543A">
             <wp:extent cx="5943600" cy="1344930"/>
@@ -563,7 +1269,7 @@
                     <pic:cNvPicPr/>
                   </pic:nvPicPr>
                   <pic:blipFill>
-                    <a:blip r:embed="rId13"/>
+                    <a:blip r:embed="rId15"/>
                     <a:stretch>
                       <a:fillRect/>
                     </a:stretch>
@@ -586,7 +1292,9 @@
     </w:p>
     <w:p>
       <w:r>
-        <w:lastRenderedPageBreak/>
+        <w:rPr>
+          <w:noProof/>
+        </w:rPr>
         <w:drawing>
           <wp:inline distT="0" distB="0" distL="0" distR="0" wp14:anchorId="07C720B4" wp14:editId="385A845D">
             <wp:extent cx="5943600" cy="1410970"/>
@@ -603,7 +1311,7 @@
                     <pic:cNvPicPr/>
                   </pic:nvPicPr>
                   <pic:blipFill>
-                    <a:blip r:embed="rId14"/>
+                    <a:blip r:embed="rId16"/>
                     <a:stretch>
                       <a:fillRect/>
                     </a:stretch>
@@ -631,6 +1339,10 @@
     </w:p>
     <w:p>
       <w:r>
+        <w:rPr>
+          <w:noProof/>
+        </w:rPr>
+        <w:lastRenderedPageBreak/>
         <w:drawing>
           <wp:inline distT="0" distB="0" distL="0" distR="0" wp14:anchorId="48FB0353" wp14:editId="3E3D3700">
             <wp:extent cx="5943600" cy="1439545"/>
@@ -647,7 +1359,7 @@
                     <pic:cNvPicPr/>
                   </pic:nvPicPr>
                   <pic:blipFill>
-                    <a:blip r:embed="rId15"/>
+                    <a:blip r:embed="rId17"/>
                     <a:stretch>
                       <a:fillRect/>
                     </a:stretch>
@@ -670,6 +1382,9 @@
     </w:p>
     <w:p>
       <w:r>
+        <w:rPr>
+          <w:noProof/>
+        </w:rPr>
         <w:drawing>
           <wp:inline distT="0" distB="0" distL="0" distR="0" wp14:anchorId="18B5B132" wp14:editId="0E8AC998">
             <wp:extent cx="5943600" cy="1523365"/>
@@ -686,7 +1401,7 @@
                     <pic:cNvPicPr/>
                   </pic:nvPicPr>
                   <pic:blipFill>
-                    <a:blip r:embed="rId16"/>
+                    <a:blip r:embed="rId18"/>
                     <a:stretch>
                       <a:fillRect/>
                     </a:stretch>
@@ -709,6 +1424,9 @@
     </w:p>
     <w:p>
       <w:r>
+        <w:rPr>
+          <w:noProof/>
+        </w:rPr>
         <w:drawing>
           <wp:inline distT="0" distB="0" distL="0" distR="0" wp14:anchorId="3C50FEE6" wp14:editId="28C9568F">
             <wp:extent cx="5943600" cy="1438910"/>
@@ -725,7 +1443,7 @@
                     <pic:cNvPicPr/>
                   </pic:nvPicPr>
                   <pic:blipFill>
-                    <a:blip r:embed="rId17"/>
+                    <a:blip r:embed="rId19"/>
                     <a:stretch>
                       <a:fillRect/>
                     </a:stretch>
@@ -747,7 +1465,18 @@
       </w:r>
     </w:p>
     <w:p>
-      <w:r>
+      <w:pPr>
+        <w:rPr>
+          <w:sz w:val="20"/>
+          <w:szCs w:val="20"/>
+        </w:rPr>
+      </w:pPr>
+      <w:r>
+        <w:rPr>
+          <w:noProof/>
+          <w:sz w:val="20"/>
+          <w:szCs w:val="20"/>
+        </w:rPr>
         <w:drawing>
           <wp:inline distT="0" distB="0" distL="0" distR="0" wp14:anchorId="33055DBF" wp14:editId="643250A6">
             <wp:extent cx="5943600" cy="1565275"/>
@@ -764,7 +1493,7 @@
                     <pic:cNvPicPr/>
                   </pic:nvPicPr>
                   <pic:blipFill>
-                    <a:blip r:embed="rId18"/>
+                    <a:blip r:embed="rId20"/>
                     <a:stretch>
                       <a:fillRect/>
                     </a:stretch>
@@ -797,22 +1526,1113 @@
           <w:b/>
           <w:bCs/>
         </w:rPr>
-        <w:lastRenderedPageBreak/>
-        <w:t>Continuous and categorical predictors, continuous target:</w:t>
-      </w:r>
-    </w:p>
-    <w:p/>
-    <w:p>
-      <w:pPr>
-        <w:rPr>
+        <w:t>Julius:</w:t>
+      </w:r>
+    </w:p>
+    <w:p>
+      <w:pPr>
+        <w:pBdr>
+          <w:top w:val="single" w:sz="2" w:space="0" w:color="auto"/>
+          <w:left w:val="single" w:sz="2" w:space="0" w:color="auto"/>
+          <w:bottom w:val="single" w:sz="2" w:space="0" w:color="auto"/>
+          <w:right w:val="single" w:sz="2" w:space="0" w:color="auto"/>
+        </w:pBdr>
+        <w:shd w:val="clear" w:color="auto" w:fill="F9FAFB"/>
+        <w:spacing w:before="100" w:beforeAutospacing="1" w:after="100" w:afterAutospacing="1" w:line="240" w:lineRule="auto"/>
+        <w:rPr>
+          <w:rFonts w:eastAsia="Times New Roman" w:cs="Times New Roman"/>
           <w:b/>
           <w:bCs/>
-        </w:rPr>
-      </w:pPr>
-      <w:r>
-        <w:rPr>
+          <w:color w:val="020817"/>
+          <w:kern w:val="0"/>
+          <w:sz w:val="20"/>
+          <w:szCs w:val="20"/>
+          <w14:ligatures w14:val="none"/>
+        </w:rPr>
+      </w:pPr>
+      <w:r>
+        <w:rPr>
+          <w:rFonts w:eastAsia="Times New Roman" w:cs="Times New Roman"/>
           <w:b/>
           <w:bCs/>
+          <w:color w:val="020817"/>
+          <w:kern w:val="0"/>
+          <w:sz w:val="20"/>
+          <w:szCs w:val="20"/>
+          <w14:ligatures w14:val="none"/>
+        </w:rPr>
+        <w:t>My target variable is GDP in current prices (millions of US dollars). I want to know what variables in these spreadsheets might be highly correlated with my target variable in 2015. You can use existing columns as variables or combine variables to create new predictors that may be of interest. Please let me know what predictors you come up with and their correlation to GDP.</w:t>
+      </w:r>
+    </w:p>
+    <w:p>
+      <w:pPr>
+        <w:rPr>
+          <w:sz w:val="20"/>
+          <w:szCs w:val="20"/>
+        </w:rPr>
+      </w:pPr>
+      <w:r>
+        <w:rPr>
+          <w:sz w:val="20"/>
+          <w:szCs w:val="20"/>
+        </w:rPr>
+        <w:t xml:space="preserve">Returned correlation matrix for 2015-specific variables but did not come up with new predictors. </w:t>
+      </w:r>
+    </w:p>
+    <w:p>
+      <w:pPr>
+        <w:rPr>
+          <w:b/>
+          <w:bCs/>
+          <w:color w:val="020817"/>
+          <w:sz w:val="20"/>
+          <w:szCs w:val="20"/>
+          <w:shd w:val="clear" w:color="auto" w:fill="F9FAFB"/>
+        </w:rPr>
+      </w:pPr>
+      <w:r>
+        <w:rPr>
+          <w:b/>
+          <w:bCs/>
+          <w:color w:val="020817"/>
+          <w:sz w:val="20"/>
+          <w:szCs w:val="20"/>
+          <w:shd w:val="clear" w:color="auto" w:fill="F9FAFB"/>
+        </w:rPr>
+        <w:t>You didn't come up with any new predictors that could be formed by combining columns. Can you please tell me if there are any of those kinds of predictors of interest and calculate their correlations?</w:t>
+      </w:r>
+    </w:p>
+    <w:p>
+      <w:pPr>
+        <w:numPr>
+          <w:ilvl w:val="0"/>
+          <w:numId w:val="12"/>
+        </w:numPr>
+        <w:pBdr>
+          <w:top w:val="single" w:sz="2" w:space="0" w:color="auto"/>
+          <w:left w:val="single" w:sz="2" w:space="5" w:color="auto"/>
+          <w:bottom w:val="single" w:sz="2" w:space="0" w:color="auto"/>
+          <w:right w:val="single" w:sz="2" w:space="0" w:color="auto"/>
+        </w:pBdr>
+        <w:shd w:val="clear" w:color="auto" w:fill="F9FAFB"/>
+        <w:spacing w:after="0" w:line="240" w:lineRule="auto"/>
+        <w:rPr>
+          <w:rFonts w:eastAsia="Times New Roman" w:cs="Times New Roman"/>
+          <w:color w:val="020817"/>
+          <w:kern w:val="0"/>
+          <w:sz w:val="20"/>
+          <w:szCs w:val="20"/>
+          <w14:ligatures w14:val="none"/>
+        </w:rPr>
+      </w:pPr>
+      <w:r>
+        <w:rPr>
+          <w:rFonts w:eastAsia="Times New Roman" w:cs="Times New Roman"/>
+          <w:b/>
+          <w:bCs/>
+          <w:color w:val="020817"/>
+          <w:kern w:val="0"/>
+          <w:sz w:val="20"/>
+          <w:szCs w:val="20"/>
+          <w:bdr w:val="single" w:sz="2" w:space="0" w:color="auto" w:frame="1"/>
+          <w14:ligatures w14:val="none"/>
+        </w:rPr>
+        <w:lastRenderedPageBreak/>
+        <w:t>Dependency Ratio</w:t>
+      </w:r>
+      <w:r>
+        <w:rPr>
+          <w:rFonts w:eastAsia="Times New Roman" w:cs="Times New Roman"/>
+          <w:color w:val="020817"/>
+          <w:kern w:val="0"/>
+          <w:sz w:val="20"/>
+          <w:szCs w:val="20"/>
+          <w14:ligatures w14:val="none"/>
+        </w:rPr>
+        <w:t>: Ratio of the population aged 0-14 and 65+ to the working-age population (15-64).</w:t>
+      </w:r>
+    </w:p>
+    <w:p>
+      <w:pPr>
+        <w:numPr>
+          <w:ilvl w:val="0"/>
+          <w:numId w:val="12"/>
+        </w:numPr>
+        <w:pBdr>
+          <w:top w:val="single" w:sz="2" w:space="0" w:color="auto"/>
+          <w:left w:val="single" w:sz="2" w:space="5" w:color="auto"/>
+          <w:bottom w:val="single" w:sz="2" w:space="0" w:color="auto"/>
+          <w:right w:val="single" w:sz="2" w:space="0" w:color="auto"/>
+        </w:pBdr>
+        <w:shd w:val="clear" w:color="auto" w:fill="F9FAFB"/>
+        <w:spacing w:after="0" w:line="240" w:lineRule="auto"/>
+        <w:rPr>
+          <w:rFonts w:eastAsia="Times New Roman" w:cs="Times New Roman"/>
+          <w:color w:val="020817"/>
+          <w:kern w:val="0"/>
+          <w:sz w:val="20"/>
+          <w:szCs w:val="20"/>
+          <w14:ligatures w14:val="none"/>
+        </w:rPr>
+      </w:pPr>
+      <w:r>
+        <w:rPr>
+          <w:rFonts w:eastAsia="Times New Roman" w:cs="Times New Roman"/>
+          <w:b/>
+          <w:bCs/>
+          <w:color w:val="020817"/>
+          <w:kern w:val="0"/>
+          <w:sz w:val="20"/>
+          <w:szCs w:val="20"/>
+          <w:bdr w:val="single" w:sz="2" w:space="0" w:color="auto" w:frame="1"/>
+          <w14:ligatures w14:val="none"/>
+        </w:rPr>
+        <w:t>Education Index</w:t>
+      </w:r>
+      <w:r>
+        <w:rPr>
+          <w:rFonts w:eastAsia="Times New Roman" w:cs="Times New Roman"/>
+          <w:color w:val="020817"/>
+          <w:kern w:val="0"/>
+          <w:sz w:val="20"/>
+          <w:szCs w:val="20"/>
+          <w14:ligatures w14:val="none"/>
+        </w:rPr>
+        <w:t>: Average of gross enrollment ratios for primary, lower secondary, and upper secondary levels.</w:t>
+      </w:r>
+    </w:p>
+    <w:p>
+      <w:pPr>
+        <w:numPr>
+          <w:ilvl w:val="0"/>
+          <w:numId w:val="12"/>
+        </w:numPr>
+        <w:pBdr>
+          <w:top w:val="single" w:sz="2" w:space="0" w:color="auto"/>
+          <w:left w:val="single" w:sz="2" w:space="5" w:color="auto"/>
+          <w:bottom w:val="single" w:sz="2" w:space="0" w:color="auto"/>
+          <w:right w:val="single" w:sz="2" w:space="0" w:color="auto"/>
+        </w:pBdr>
+        <w:shd w:val="clear" w:color="auto" w:fill="F9FAFB"/>
+        <w:spacing w:after="0" w:line="240" w:lineRule="auto"/>
+        <w:rPr>
+          <w:rFonts w:eastAsia="Times New Roman" w:cs="Times New Roman"/>
+          <w:color w:val="020817"/>
+          <w:kern w:val="0"/>
+          <w:sz w:val="20"/>
+          <w:szCs w:val="20"/>
+          <w14:ligatures w14:val="none"/>
+        </w:rPr>
+      </w:pPr>
+      <w:r>
+        <w:rPr>
+          <w:rFonts w:eastAsia="Times New Roman" w:cs="Times New Roman"/>
+          <w:b/>
+          <w:bCs/>
+          <w:color w:val="020817"/>
+          <w:kern w:val="0"/>
+          <w:sz w:val="20"/>
+          <w:szCs w:val="20"/>
+          <w:bdr w:val="single" w:sz="2" w:space="0" w:color="auto" w:frame="1"/>
+          <w14:ligatures w14:val="none"/>
+        </w:rPr>
+        <w:t>Health Expenditure per Capita</w:t>
+      </w:r>
+      <w:r>
+        <w:rPr>
+          <w:rFonts w:eastAsia="Times New Roman" w:cs="Times New Roman"/>
+          <w:color w:val="020817"/>
+          <w:kern w:val="0"/>
+          <w:sz w:val="20"/>
+          <w:szCs w:val="20"/>
+          <w14:ligatures w14:val="none"/>
+        </w:rPr>
+        <w:t>: Current health expenditure as a percentage of GDP divided by the total population.</w:t>
+      </w:r>
+    </w:p>
+    <w:p>
+      <w:pPr>
+        <w:numPr>
+          <w:ilvl w:val="0"/>
+          <w:numId w:val="12"/>
+        </w:numPr>
+        <w:pBdr>
+          <w:top w:val="single" w:sz="2" w:space="0" w:color="auto"/>
+          <w:left w:val="single" w:sz="2" w:space="5" w:color="auto"/>
+          <w:bottom w:val="single" w:sz="2" w:space="0" w:color="auto"/>
+          <w:right w:val="single" w:sz="2" w:space="0" w:color="auto"/>
+        </w:pBdr>
+        <w:shd w:val="clear" w:color="auto" w:fill="F9FAFB"/>
+        <w:spacing w:after="0" w:line="240" w:lineRule="auto"/>
+        <w:rPr>
+          <w:rFonts w:eastAsia="Times New Roman" w:cs="Times New Roman"/>
+          <w:color w:val="020817"/>
+          <w:kern w:val="0"/>
+          <w:sz w:val="20"/>
+          <w:szCs w:val="20"/>
+          <w14:ligatures w14:val="none"/>
+        </w:rPr>
+      </w:pPr>
+      <w:r>
+        <w:rPr>
+          <w:rFonts w:eastAsia="Times New Roman" w:cs="Times New Roman"/>
+          <w:b/>
+          <w:bCs/>
+          <w:color w:val="020817"/>
+          <w:kern w:val="0"/>
+          <w:sz w:val="20"/>
+          <w:szCs w:val="20"/>
+          <w:bdr w:val="single" w:sz="2" w:space="0" w:color="auto" w:frame="1"/>
+          <w14:ligatures w14:val="none"/>
+        </w:rPr>
+        <w:t>Employment in Services Ratio</w:t>
+      </w:r>
+      <w:r>
+        <w:rPr>
+          <w:rFonts w:eastAsia="Times New Roman" w:cs="Times New Roman"/>
+          <w:color w:val="020817"/>
+          <w:kern w:val="0"/>
+          <w:sz w:val="20"/>
+          <w:szCs w:val="20"/>
+          <w14:ligatures w14:val="none"/>
+        </w:rPr>
+        <w:t>: Ratio of employment in services for males to females.</w:t>
+      </w:r>
+    </w:p>
+    <w:p>
+      <w:pPr>
+        <w:rPr>
+          <w:sz w:val="20"/>
+          <w:szCs w:val="20"/>
+        </w:rPr>
+      </w:pPr>
+      <w:r>
+        <w:rPr>
+          <w:noProof/>
+          <w:sz w:val="20"/>
+          <w:szCs w:val="20"/>
+        </w:rPr>
+        <w:drawing>
+          <wp:inline distT="0" distB="0" distL="0" distR="0" wp14:anchorId="373502AE" wp14:editId="17637DE2">
+            <wp:extent cx="5943600" cy="1363345"/>
+            <wp:effectExtent l="0" t="0" r="0" b="8255"/>
+            <wp:docPr id="1383253390" name="Picture 1" descr="A screenshot of a computer&#10;&#10;Description automatically generated"/>
+            <wp:cNvGraphicFramePr>
+              <a:graphicFrameLocks xmlns:a="http://schemas.openxmlformats.org/drawingml/2006/main" noChangeAspect="1"/>
+            </wp:cNvGraphicFramePr>
+            <a:graphic xmlns:a="http://schemas.openxmlformats.org/drawingml/2006/main">
+              <a:graphicData uri="http://schemas.openxmlformats.org/drawingml/2006/picture">
+                <pic:pic xmlns:pic="http://schemas.openxmlformats.org/drawingml/2006/picture">
+                  <pic:nvPicPr>
+                    <pic:cNvPr id="1383253390" name="Picture 1" descr="A screenshot of a computer&#10;&#10;Description automatically generated"/>
+                    <pic:cNvPicPr/>
+                  </pic:nvPicPr>
+                  <pic:blipFill>
+                    <a:blip r:embed="rId21"/>
+                    <a:stretch>
+                      <a:fillRect/>
+                    </a:stretch>
+                  </pic:blipFill>
+                  <pic:spPr>
+                    <a:xfrm>
+                      <a:off x="0" y="0"/>
+                      <a:ext cx="5943600" cy="1363345"/>
+                    </a:xfrm>
+                    <a:prstGeom prst="rect">
+                      <a:avLst/>
+                    </a:prstGeom>
+                  </pic:spPr>
+                </pic:pic>
+              </a:graphicData>
+            </a:graphic>
+          </wp:inline>
+        </w:drawing>
+      </w:r>
+    </w:p>
+    <w:p>
+      <w:pPr>
+        <w:rPr>
+          <w:sz w:val="20"/>
+          <w:szCs w:val="20"/>
+        </w:rPr>
+      </w:pPr>
+      <w:r>
+        <w:rPr>
+          <w:sz w:val="20"/>
+          <w:szCs w:val="20"/>
+        </w:rPr>
+        <w:t xml:space="preserve">Ended up creating the above correlation table (note that not all the expected predictors actually made it into the table and that some predictors changed). </w:t>
+      </w:r>
+    </w:p>
+    <w:p>
+      <w:pPr>
+        <w:rPr>
+          <w:b/>
+          <w:bCs/>
+          <w:color w:val="020817"/>
+          <w:sz w:val="20"/>
+          <w:szCs w:val="20"/>
+          <w:shd w:val="clear" w:color="auto" w:fill="F9FAFB"/>
+        </w:rPr>
+      </w:pPr>
+      <w:r>
+        <w:rPr>
+          <w:b/>
+          <w:bCs/>
+          <w:color w:val="020817"/>
+          <w:sz w:val="20"/>
+          <w:szCs w:val="20"/>
+          <w:shd w:val="clear" w:color="auto" w:fill="F9FAFB"/>
+        </w:rPr>
+        <w:t>I want to know what variables are the strongest predictors of GDP. Please test both the old and new variables as predictors. Please remember to check for multicollinearity before adding the variables to any predictive model</w:t>
+      </w:r>
+    </w:p>
+    <w:p>
+      <w:pPr>
+        <w:rPr>
+          <w:color w:val="020817"/>
+          <w:sz w:val="20"/>
+          <w:szCs w:val="20"/>
+          <w:shd w:val="clear" w:color="auto" w:fill="F9FAFB"/>
+        </w:rPr>
+      </w:pPr>
+      <w:r>
+        <w:rPr>
+          <w:color w:val="020817"/>
+          <w:sz w:val="20"/>
+          <w:szCs w:val="20"/>
+          <w:shd w:val="clear" w:color="auto" w:fill="F9FAFB"/>
+        </w:rPr>
+        <w:t xml:space="preserve">Ran VIF and then linear regression, but only did so for one spreadsheet of data (population). Also did not consider VIF as an iterative process and did not include a constant in either the VIF calculations or the linear regression model itself. </w:t>
+      </w:r>
+    </w:p>
+    <w:p>
+      <w:pPr>
+        <w:rPr>
+          <w:b/>
+          <w:bCs/>
+          <w:color w:val="020817"/>
+          <w:sz w:val="20"/>
+          <w:szCs w:val="20"/>
+          <w:shd w:val="clear" w:color="auto" w:fill="F9FAFB"/>
+        </w:rPr>
+      </w:pPr>
+      <w:r>
+        <w:rPr>
+          <w:b/>
+          <w:bCs/>
+          <w:color w:val="020817"/>
+          <w:sz w:val="20"/>
+          <w:szCs w:val="20"/>
+          <w:shd w:val="clear" w:color="auto" w:fill="F9FAFB"/>
+        </w:rPr>
+        <w:t>It doesn't appear like you used all possible variables that were provided in the spreadsheets. Remember to only run the analysis for 2015. You also did not add a constant to the model</w:t>
+      </w:r>
+    </w:p>
+    <w:p>
+      <w:pPr>
+        <w:rPr>
+          <w:color w:val="020817"/>
+          <w:sz w:val="20"/>
+          <w:szCs w:val="20"/>
+          <w:shd w:val="clear" w:color="auto" w:fill="F9FAFB"/>
+        </w:rPr>
+      </w:pPr>
+      <w:r>
+        <w:rPr>
+          <w:color w:val="020817"/>
+          <w:sz w:val="20"/>
+          <w:szCs w:val="20"/>
+          <w:shd w:val="clear" w:color="auto" w:fill="F9FAFB"/>
+        </w:rPr>
+        <w:t xml:space="preserve">Added a constant and ran the analysis for 2015 only but still only used one spreadsheet. </w:t>
+      </w:r>
+      <w:r>
+        <w:rPr>
+          <w:color w:val="020817"/>
+          <w:sz w:val="20"/>
+          <w:szCs w:val="20"/>
+          <w:shd w:val="clear" w:color="auto" w:fill="F9FAFB"/>
+        </w:rPr>
+        <w:t>VIF was once again not iterative.</w:t>
+      </w:r>
+    </w:p>
+    <w:p>
+      <w:pPr>
+        <w:rPr>
+          <w:sz w:val="20"/>
+          <w:szCs w:val="20"/>
+        </w:rPr>
+      </w:pPr>
+      <w:r>
+        <w:rPr>
+          <w:noProof/>
+          <w:sz w:val="20"/>
+          <w:szCs w:val="20"/>
+        </w:rPr>
+        <w:drawing>
+          <wp:inline distT="0" distB="0" distL="0" distR="0" wp14:anchorId="6A9CE6B1" wp14:editId="1A948C17">
+            <wp:extent cx="4238625" cy="1866172"/>
+            <wp:effectExtent l="0" t="0" r="0" b="1270"/>
+            <wp:docPr id="2024513364" name="Picture 1" descr="A white paper with black text&#10;&#10;Description automatically generated"/>
+            <wp:cNvGraphicFramePr>
+              <a:graphicFrameLocks xmlns:a="http://schemas.openxmlformats.org/drawingml/2006/main" noChangeAspect="1"/>
+            </wp:cNvGraphicFramePr>
+            <a:graphic xmlns:a="http://schemas.openxmlformats.org/drawingml/2006/main">
+              <a:graphicData uri="http://schemas.openxmlformats.org/drawingml/2006/picture">
+                <pic:pic xmlns:pic="http://schemas.openxmlformats.org/drawingml/2006/picture">
+                  <pic:nvPicPr>
+                    <pic:cNvPr id="2024513364" name="Picture 1" descr="A white paper with black text&#10;&#10;Description automatically generated"/>
+                    <pic:cNvPicPr/>
+                  </pic:nvPicPr>
+                  <pic:blipFill>
+                    <a:blip r:embed="rId22"/>
+                    <a:stretch>
+                      <a:fillRect/>
+                    </a:stretch>
+                  </pic:blipFill>
+                  <pic:spPr>
+                    <a:xfrm>
+                      <a:off x="0" y="0"/>
+                      <a:ext cx="4246384" cy="1869588"/>
+                    </a:xfrm>
+                    <a:prstGeom prst="rect">
+                      <a:avLst/>
+                    </a:prstGeom>
+                  </pic:spPr>
+                </pic:pic>
+              </a:graphicData>
+            </a:graphic>
+          </wp:inline>
+        </w:drawing>
+      </w:r>
+    </w:p>
+    <w:p>
+      <w:pPr>
+        <w:rPr>
+          <w:lang w:val="es-ES"/>
+        </w:rPr>
+      </w:pPr>
+      <w:r>
+        <w:rPr>
+          <w:b/>
+          <w:bCs/>
+          <w:lang w:val="es-ES"/>
+        </w:rPr>
+        <w:t>GPT 4o:</w:t>
+      </w:r>
+      <w:r>
+        <w:rPr>
+          <w:b/>
+          <w:bCs/>
+          <w:lang w:val="es-ES"/>
+        </w:rPr>
+        <w:t xml:space="preserve"> </w:t>
+      </w:r>
+      <w:hyperlink r:id="rId23" w:history="1">
+        <w:r>
+          <w:rPr>
+            <w:rStyle w:val="Hyperlink"/>
+            <w:lang w:val="es-ES"/>
+          </w:rPr>
+          <w:t>https://platform.openai.com/playground/chat?models=gpt-4o&amp;preset=preset-JVpouR7bw3eEMJi5hgwPuh8K</w:t>
+        </w:r>
+      </w:hyperlink>
+    </w:p>
+    <w:p>
+      <w:pPr>
+        <w:pStyle w:val="NormalWeb"/>
+        <w:rPr>
+          <w:rFonts w:asciiTheme="minorHAnsi" w:hAnsiTheme="minorHAnsi"/>
+          <w:sz w:val="20"/>
+          <w:szCs w:val="20"/>
+        </w:rPr>
+      </w:pPr>
+      <w:r>
+        <w:rPr>
+          <w:rFonts w:asciiTheme="minorHAnsi" w:hAnsiTheme="minorHAnsi"/>
+          <w:sz w:val="20"/>
+          <w:szCs w:val="20"/>
+        </w:rPr>
+        <w:t>Couldn’t upload files</w:t>
+      </w:r>
+      <w:r>
+        <w:rPr>
+          <w:rFonts w:asciiTheme="minorHAnsi" w:hAnsiTheme="minorHAnsi"/>
+          <w:sz w:val="20"/>
+          <w:szCs w:val="20"/>
+        </w:rPr>
+        <w:t xml:space="preserve"> to Playground</w:t>
+      </w:r>
+      <w:r>
+        <w:rPr>
+          <w:rFonts w:asciiTheme="minorHAnsi" w:hAnsiTheme="minorHAnsi"/>
+          <w:sz w:val="20"/>
+          <w:szCs w:val="20"/>
+        </w:rPr>
+        <w:t xml:space="preserve">, so manually gave all variables and the target variable. </w:t>
+      </w:r>
+    </w:p>
+    <w:p>
+      <w:pPr>
+        <w:pStyle w:val="NormalWeb"/>
+        <w:rPr>
+          <w:rFonts w:asciiTheme="minorHAnsi" w:hAnsiTheme="minorHAnsi"/>
+          <w:b/>
+          <w:bCs/>
+          <w:sz w:val="20"/>
+          <w:szCs w:val="20"/>
+        </w:rPr>
+      </w:pPr>
+      <w:r>
+        <w:rPr>
+          <w:rFonts w:asciiTheme="minorHAnsi" w:hAnsiTheme="minorHAnsi"/>
+          <w:b/>
+          <w:bCs/>
+          <w:sz w:val="20"/>
+          <w:szCs w:val="20"/>
+        </w:rPr>
+        <w:lastRenderedPageBreak/>
+        <w:t xml:space="preserve">Select variables that might be highly correlated with GDP. These can be existing variables or combinations of variables. </w:t>
+      </w:r>
+    </w:p>
+    <w:p>
+      <w:pPr>
+        <w:rPr>
+          <w:sz w:val="20"/>
+          <w:szCs w:val="20"/>
+        </w:rPr>
+      </w:pPr>
+      <w:r>
+        <w:rPr>
+          <w:sz w:val="20"/>
+          <w:szCs w:val="20"/>
+        </w:rPr>
+        <w:t>Generated the full workflow:</w:t>
+      </w:r>
+    </w:p>
+    <w:p>
+      <w:pPr>
+        <w:pStyle w:val="ListParagraph"/>
+        <w:numPr>
+          <w:ilvl w:val="0"/>
+          <w:numId w:val="10"/>
+        </w:numPr>
+        <w:rPr>
+          <w:sz w:val="20"/>
+          <w:szCs w:val="20"/>
+        </w:rPr>
+      </w:pPr>
+      <w:r>
+        <w:rPr>
+          <w:sz w:val="20"/>
+          <w:szCs w:val="20"/>
+        </w:rPr>
+        <w:t>Preprocessing (scaling, normalizing, feature imputation)</w:t>
+      </w:r>
+    </w:p>
+    <w:p>
+      <w:pPr>
+        <w:pStyle w:val="ListParagraph"/>
+        <w:numPr>
+          <w:ilvl w:val="0"/>
+          <w:numId w:val="10"/>
+        </w:numPr>
+        <w:rPr>
+          <w:sz w:val="20"/>
+          <w:szCs w:val="20"/>
+        </w:rPr>
+      </w:pPr>
+      <w:r>
+        <w:rPr>
+          <w:sz w:val="20"/>
+          <w:szCs w:val="20"/>
+        </w:rPr>
+        <w:t>Correlation matrix</w:t>
+      </w:r>
+    </w:p>
+    <w:p>
+      <w:pPr>
+        <w:pStyle w:val="ListParagraph"/>
+        <w:numPr>
+          <w:ilvl w:val="0"/>
+          <w:numId w:val="10"/>
+        </w:numPr>
+        <w:rPr>
+          <w:i/>
+          <w:iCs/>
+          <w:sz w:val="20"/>
+          <w:szCs w:val="20"/>
+        </w:rPr>
+      </w:pPr>
+      <w:r>
+        <w:rPr>
+          <w:sz w:val="20"/>
+          <w:szCs w:val="20"/>
+        </w:rPr>
+        <w:t xml:space="preserve">PCA </w:t>
+      </w:r>
+      <w:r>
+        <w:rPr>
+          <w:i/>
+          <w:iCs/>
+          <w:sz w:val="20"/>
+          <w:szCs w:val="20"/>
+        </w:rPr>
+        <w:t>(this isn’t in my workflow since I feel it makes our problem harder to interpret… each coefficient then represents a principal component instead of a variable. But it does reduce dimensionality)</w:t>
+      </w:r>
+    </w:p>
+    <w:p>
+      <w:pPr>
+        <w:pStyle w:val="ListParagraph"/>
+        <w:numPr>
+          <w:ilvl w:val="0"/>
+          <w:numId w:val="10"/>
+        </w:numPr>
+        <w:rPr>
+          <w:sz w:val="20"/>
+          <w:szCs w:val="20"/>
+        </w:rPr>
+      </w:pPr>
+      <w:r>
+        <w:rPr>
+          <w:sz w:val="20"/>
+          <w:szCs w:val="20"/>
+        </w:rPr>
+        <w:t>VIF</w:t>
+      </w:r>
+    </w:p>
+    <w:p>
+      <w:pPr>
+        <w:pStyle w:val="ListParagraph"/>
+        <w:numPr>
+          <w:ilvl w:val="0"/>
+          <w:numId w:val="10"/>
+        </w:numPr>
+        <w:rPr>
+          <w:sz w:val="20"/>
+          <w:szCs w:val="20"/>
+        </w:rPr>
+      </w:pPr>
+      <w:r>
+        <w:rPr>
+          <w:sz w:val="20"/>
+          <w:szCs w:val="20"/>
+        </w:rPr>
+        <w:t>Linear regression</w:t>
+      </w:r>
+    </w:p>
+    <w:p>
+      <w:pPr>
+        <w:pStyle w:val="ListParagraph"/>
+        <w:numPr>
+          <w:ilvl w:val="0"/>
+          <w:numId w:val="10"/>
+        </w:numPr>
+        <w:rPr>
+          <w:sz w:val="20"/>
+          <w:szCs w:val="20"/>
+        </w:rPr>
+      </w:pPr>
+      <w:r>
+        <w:rPr>
+          <w:sz w:val="20"/>
+          <w:szCs w:val="20"/>
+        </w:rPr>
+        <w:t xml:space="preserve">Feature selection and cross-validation </w:t>
+      </w:r>
+      <w:r>
+        <w:rPr>
+          <w:i/>
+          <w:iCs/>
+          <w:sz w:val="20"/>
+          <w:szCs w:val="20"/>
+        </w:rPr>
+        <w:t>(this isn’t a large part of my workflow)</w:t>
+      </w:r>
+    </w:p>
+    <w:p>
+      <w:pPr>
+        <w:pStyle w:val="NormalWeb"/>
+        <w:rPr>
+          <w:rFonts w:asciiTheme="minorHAnsi" w:hAnsiTheme="minorHAnsi"/>
+          <w:b/>
+          <w:bCs/>
+          <w:sz w:val="20"/>
+          <w:szCs w:val="20"/>
+        </w:rPr>
+      </w:pPr>
+      <w:r>
+        <w:rPr>
+          <w:rFonts w:asciiTheme="minorHAnsi" w:hAnsiTheme="minorHAnsi"/>
+          <w:b/>
+          <w:bCs/>
+          <w:sz w:val="20"/>
+          <w:szCs w:val="20"/>
+        </w:rPr>
+        <w:t>Please provide a list of all new variables that you think would be strong predictors of GDP</w:t>
+      </w:r>
+    </w:p>
+    <w:p>
+      <w:pPr>
+        <w:pStyle w:val="NormalWeb"/>
+        <w:rPr>
+          <w:rFonts w:asciiTheme="minorHAnsi" w:hAnsiTheme="minorHAnsi"/>
+          <w:sz w:val="20"/>
+          <w:szCs w:val="20"/>
+        </w:rPr>
+      </w:pPr>
+      <w:r>
+        <w:rPr>
+          <w:rFonts w:asciiTheme="minorHAnsi" w:hAnsiTheme="minorHAnsi"/>
+          <w:sz w:val="20"/>
+          <w:szCs w:val="20"/>
+        </w:rPr>
+        <w:t>1. Employment in Agriculture Ratio</w:t>
+      </w:r>
+    </w:p>
+    <w:p>
+      <w:pPr>
+        <w:pStyle w:val="NormalWeb"/>
+        <w:rPr>
+          <w:rFonts w:asciiTheme="minorHAnsi" w:hAnsiTheme="minorHAnsi"/>
+          <w:sz w:val="20"/>
+          <w:szCs w:val="20"/>
+        </w:rPr>
+      </w:pPr>
+      <w:r>
+        <w:rPr>
+          <w:rFonts w:asciiTheme="minorHAnsi" w:hAnsiTheme="minorHAnsi"/>
+          <w:sz w:val="20"/>
+          <w:szCs w:val="20"/>
+        </w:rPr>
+        <w:t>2. Employment in Industry Ratio</w:t>
+      </w:r>
+    </w:p>
+    <w:p>
+      <w:pPr>
+        <w:pStyle w:val="NormalWeb"/>
+        <w:rPr>
+          <w:rFonts w:asciiTheme="minorHAnsi" w:hAnsiTheme="minorHAnsi"/>
+          <w:sz w:val="20"/>
+          <w:szCs w:val="20"/>
+        </w:rPr>
+      </w:pPr>
+      <w:r>
+        <w:rPr>
+          <w:rFonts w:asciiTheme="minorHAnsi" w:hAnsiTheme="minorHAnsi"/>
+          <w:sz w:val="20"/>
+          <w:szCs w:val="20"/>
+        </w:rPr>
+        <w:t>3. Employment in Services Ratio</w:t>
+      </w:r>
+    </w:p>
+    <w:p>
+      <w:pPr>
+        <w:pStyle w:val="NormalWeb"/>
+        <w:rPr>
+          <w:rFonts w:asciiTheme="minorHAnsi" w:hAnsiTheme="minorHAnsi"/>
+          <w:sz w:val="20"/>
+          <w:szCs w:val="20"/>
+        </w:rPr>
+      </w:pPr>
+      <w:r>
+        <w:rPr>
+          <w:rFonts w:asciiTheme="minorHAnsi" w:hAnsiTheme="minorHAnsi"/>
+          <w:sz w:val="20"/>
+          <w:szCs w:val="20"/>
+        </w:rPr>
+        <w:t>4. Health Expenditure x Life Expectancy</w:t>
+      </w:r>
+    </w:p>
+    <w:p>
+      <w:pPr>
+        <w:pStyle w:val="NormalWeb"/>
+        <w:rPr>
+          <w:rFonts w:asciiTheme="minorHAnsi" w:hAnsiTheme="minorHAnsi"/>
+          <w:sz w:val="20"/>
+          <w:szCs w:val="20"/>
+        </w:rPr>
+      </w:pPr>
+      <w:r>
+        <w:rPr>
+          <w:rFonts w:asciiTheme="minorHAnsi" w:hAnsiTheme="minorHAnsi"/>
+          <w:sz w:val="20"/>
+          <w:szCs w:val="20"/>
+        </w:rPr>
+        <w:t>5. Education Investment per Capita</w:t>
+      </w:r>
+    </w:p>
+    <w:p>
+      <w:pPr>
+        <w:pStyle w:val="NormalWeb"/>
+        <w:rPr>
+          <w:rFonts w:asciiTheme="minorHAnsi" w:hAnsiTheme="minorHAnsi"/>
+          <w:sz w:val="20"/>
+          <w:szCs w:val="20"/>
+        </w:rPr>
+      </w:pPr>
+      <w:r>
+        <w:rPr>
+          <w:rFonts w:asciiTheme="minorHAnsi" w:hAnsiTheme="minorHAnsi"/>
+          <w:sz w:val="20"/>
+          <w:szCs w:val="20"/>
+        </w:rPr>
+        <w:t>6. Dependent Population Ratio</w:t>
+      </w:r>
+    </w:p>
+    <w:p>
+      <w:pPr>
+        <w:pStyle w:val="NormalWeb"/>
+        <w:rPr>
+          <w:rFonts w:asciiTheme="minorHAnsi" w:hAnsiTheme="minorHAnsi"/>
+          <w:sz w:val="20"/>
+          <w:szCs w:val="20"/>
+        </w:rPr>
+      </w:pPr>
+      <w:r>
+        <w:rPr>
+          <w:rFonts w:asciiTheme="minorHAnsi" w:hAnsiTheme="minorHAnsi"/>
+          <w:sz w:val="20"/>
+          <w:szCs w:val="20"/>
+        </w:rPr>
+        <w:t>7. Unemployment Impact</w:t>
+      </w:r>
+    </w:p>
+    <w:p>
+      <w:pPr>
+        <w:pStyle w:val="NormalWeb"/>
+        <w:rPr>
+          <w:rFonts w:asciiTheme="minorHAnsi" w:hAnsiTheme="minorHAnsi"/>
+          <w:sz w:val="20"/>
+          <w:szCs w:val="20"/>
+        </w:rPr>
+      </w:pPr>
+      <w:r>
+        <w:rPr>
+          <w:rFonts w:asciiTheme="minorHAnsi" w:hAnsiTheme="minorHAnsi"/>
+          <w:sz w:val="20"/>
+          <w:szCs w:val="20"/>
+        </w:rPr>
+        <w:t>8. Female Workforce Contribution</w:t>
+      </w:r>
+    </w:p>
+    <w:p>
+      <w:pPr>
+        <w:pStyle w:val="NormalWeb"/>
+        <w:rPr>
+          <w:rFonts w:asciiTheme="minorHAnsi" w:hAnsiTheme="minorHAnsi"/>
+          <w:sz w:val="20"/>
+          <w:szCs w:val="20"/>
+        </w:rPr>
+      </w:pPr>
+      <w:r>
+        <w:rPr>
+          <w:rFonts w:asciiTheme="minorHAnsi" w:hAnsiTheme="minorHAnsi"/>
+          <w:sz w:val="20"/>
+          <w:szCs w:val="20"/>
+        </w:rPr>
+        <w:t>9. Educational Attainment Index</w:t>
+      </w:r>
+    </w:p>
+    <w:p>
+      <w:pPr>
+        <w:rPr>
+          <w:b/>
+          <w:bCs/>
+        </w:rPr>
+      </w:pPr>
+      <w:r>
+        <w:rPr>
+          <w:b/>
+          <w:bCs/>
+        </w:rPr>
+        <w:t>Copilot:</w:t>
+      </w:r>
+    </w:p>
+    <w:p>
+      <w:r>
+        <w:t>Gave similar list of features and target variable.</w:t>
+      </w:r>
+    </w:p>
+    <w:p>
+      <w:pPr>
+        <w:rPr>
+          <w:rFonts w:ascii="Arial" w:hAnsi="Arial" w:cs="Arial"/>
+          <w:color w:val="222222"/>
+          <w:shd w:val="clear" w:color="auto" w:fill="FFFFFF"/>
+        </w:rPr>
+      </w:pPr>
+      <w:r>
+        <w:rPr>
+          <w:rFonts w:ascii="Arial" w:hAnsi="Arial" w:cs="Arial"/>
+          <w:color w:val="222222"/>
+          <w:shd w:val="clear" w:color="auto" w:fill="FFFFFF"/>
+        </w:rPr>
+        <w:t>As a first step please determine what features might be good candidates as highly correlated to the target variable. Make a list of both existing features and combinations of features</w:t>
+      </w:r>
+    </w:p>
+    <w:p>
+      <w:r>
+        <w:rPr>
+          <w:noProof/>
+        </w:rPr>
+        <w:lastRenderedPageBreak/>
+        <w:drawing>
+          <wp:inline distT="0" distB="0" distL="0" distR="0" wp14:anchorId="405A128F" wp14:editId="448DEBA2">
+            <wp:extent cx="5943600" cy="3589655"/>
+            <wp:effectExtent l="0" t="0" r="0" b="0"/>
+            <wp:docPr id="671035533" name="Picture 1" descr="A screenshot of a computer&#10;&#10;Description automatically generated"/>
+            <wp:cNvGraphicFramePr>
+              <a:graphicFrameLocks xmlns:a="http://schemas.openxmlformats.org/drawingml/2006/main" noChangeAspect="1"/>
+            </wp:cNvGraphicFramePr>
+            <a:graphic xmlns:a="http://schemas.openxmlformats.org/drawingml/2006/main">
+              <a:graphicData uri="http://schemas.openxmlformats.org/drawingml/2006/picture">
+                <pic:pic xmlns:pic="http://schemas.openxmlformats.org/drawingml/2006/picture">
+                  <pic:nvPicPr>
+                    <pic:cNvPr id="671035533" name="Picture 1" descr="A screenshot of a computer&#10;&#10;Description automatically generated"/>
+                    <pic:cNvPicPr/>
+                  </pic:nvPicPr>
+                  <pic:blipFill>
+                    <a:blip r:embed="rId24"/>
+                    <a:stretch>
+                      <a:fillRect/>
+                    </a:stretch>
+                  </pic:blipFill>
+                  <pic:spPr>
+                    <a:xfrm>
+                      <a:off x="0" y="0"/>
+                      <a:ext cx="5943600" cy="3589655"/>
+                    </a:xfrm>
+                    <a:prstGeom prst="rect">
+                      <a:avLst/>
+                    </a:prstGeom>
+                  </pic:spPr>
+                </pic:pic>
+              </a:graphicData>
+            </a:graphic>
+          </wp:inline>
+        </w:drawing>
+      </w:r>
+    </w:p>
+    <w:p>
+      <w:pPr>
+        <w:rPr>
+          <w:rFonts w:ascii="Arial" w:hAnsi="Arial" w:cs="Arial"/>
+          <w:color w:val="222222"/>
+          <w:shd w:val="clear" w:color="auto" w:fill="FFFFFF"/>
+        </w:rPr>
+      </w:pPr>
+      <w:r>
+        <w:rPr>
+          <w:rFonts w:ascii="Arial" w:hAnsi="Arial" w:cs="Arial"/>
+          <w:color w:val="222222"/>
+          <w:shd w:val="clear" w:color="auto" w:fill="FFFFFF"/>
+        </w:rPr>
+        <w:t>What steps would you take to determine what variables would be most important in predicting GDP? Please consider multicollinearity</w:t>
+      </w:r>
+    </w:p>
+    <w:p>
+      <w:pPr>
+        <w:pStyle w:val="ListParagraph"/>
+        <w:numPr>
+          <w:ilvl w:val="0"/>
+          <w:numId w:val="10"/>
+        </w:numPr>
+      </w:pPr>
+      <w:r>
+        <w:t>Correlation matrix</w:t>
+      </w:r>
+    </w:p>
+    <w:p>
+      <w:pPr>
+        <w:pStyle w:val="ListParagraph"/>
+        <w:numPr>
+          <w:ilvl w:val="0"/>
+          <w:numId w:val="10"/>
+        </w:numPr>
+      </w:pPr>
+      <w:r>
+        <w:t xml:space="preserve">VIF </w:t>
+      </w:r>
+      <w:r>
+        <w:rPr>
+          <w:i/>
+          <w:iCs/>
+        </w:rPr>
+        <w:t>(not part of workflow when I didn’t specify multicollinearity)</w:t>
+      </w:r>
+    </w:p>
+    <w:p>
+      <w:pPr>
+        <w:pStyle w:val="ListParagraph"/>
+        <w:numPr>
+          <w:ilvl w:val="0"/>
+          <w:numId w:val="10"/>
+        </w:numPr>
+      </w:pPr>
+      <w:r>
+        <w:t>PCA, regression, RFE w/ regression model</w:t>
+      </w:r>
+    </w:p>
+    <w:p>
+      <w:pPr>
+        <w:pStyle w:val="ListParagraph"/>
+        <w:numPr>
+          <w:ilvl w:val="0"/>
+          <w:numId w:val="10"/>
+        </w:numPr>
+      </w:pPr>
+      <w:r>
+        <w:t xml:space="preserve">Random Forest, Gradient Boosting </w:t>
+      </w:r>
+      <w:r>
+        <w:rPr>
+          <w:i/>
+          <w:iCs/>
+        </w:rPr>
+        <w:t>(These were the models selected even when my question was just about correlations and not predictions)</w:t>
+      </w:r>
+    </w:p>
+    <w:p>
+      <w:pPr>
+        <w:pStyle w:val="ListParagraph"/>
+        <w:numPr>
+          <w:ilvl w:val="0"/>
+          <w:numId w:val="10"/>
+        </w:numPr>
+      </w:pPr>
+      <w:r>
+        <w:t>Cross-validation</w:t>
+      </w:r>
+    </w:p>
+    <w:p>
+      <w:pPr>
+        <w:rPr>
+          <w:b/>
+          <w:bCs/>
+        </w:rPr>
+      </w:pPr>
+      <w:r>
+        <w:rPr>
+          <w:b/>
+          <w:bCs/>
+        </w:rPr>
+        <w:t>Continuous and categorical predictors, continuous target:</w:t>
+      </w:r>
+    </w:p>
+    <w:p/>
+    <w:p>
+      <w:pPr>
+        <w:rPr>
+          <w:b/>
+          <w:bCs/>
+        </w:rPr>
+      </w:pPr>
+      <w:r>
+        <w:rPr>
+          <w:b/>
+          <w:bCs/>
         </w:rPr>
         <w:t>Continuous and categorical predictors, categorical (multiclass) target:</w:t>
       </w:r>
@@ -827,15 +2647,11 @@
     </w:p>
     <w:p>
       <w:r>
-        <w:t xml:space="preserve">Because the target variable was categorical, I then used multinomial logistic regression instead of multiple linear regression for multivariate correlations and predictions. I first one-hot encoded my categorical variables and combined infrequent values into an “Other category.” This still significantly expanded the number of features to 3000. I tried using PCA (this took a long time to run), but it required many PCs (50) and had a slightly lower accuracy (77%) (3 PCs had an accuracy of 48%) than just throwing all the features into the model (78%). PCA is also harder to interpret when answering the question of “which predictors have the most impact on the target variable” as each PC is made of a mix of </w:t>
-      </w:r>
-      <w:proofErr w:type="gramStart"/>
-      <w:r>
-        <w:t>the predictors</w:t>
-      </w:r>
-      <w:proofErr w:type="gramEnd"/>
-      <w:r>
-        <w:t>. I then printed out the 10 most impactful features for each target outcome. The predictors make sense for each outcome.</w:t>
+        <w:t xml:space="preserve">Because the target variable was categorical, I then used multinomial logistic regression instead of multiple linear regression for multivariate correlations and predictions. I first one-hot encoded my categorical variables and combined infrequent values into an “Other category.” This still significantly expanded the number of features to 3000. I tried using PCA (this took a long time to </w:t>
+      </w:r>
+      <w:r>
+        <w:lastRenderedPageBreak/>
+        <w:t>run), but it required many PCs (50) and had a slightly lower accuracy (77%) (3 PCs had an accuracy of 48%) than just throwing all the features into the model (78%). PCA is also harder to interpret when answering the question of “which predictors have the most impact on the target variable” as each PC is made of a mix of the predictors. I then printed out the 10 most impactful features for each target outcome. The predictors make sense for each outcome.</w:t>
       </w:r>
     </w:p>
     <w:p>
@@ -864,7 +2680,7 @@
                     <pic:cNvPicPr/>
                   </pic:nvPicPr>
                   <pic:blipFill>
-                    <a:blip r:embed="rId19"/>
+                    <a:blip r:embed="rId25"/>
                     <a:stretch>
                       <a:fillRect/>
                     </a:stretch>
@@ -907,7 +2723,7 @@
                     <pic:cNvPicPr/>
                   </pic:nvPicPr>
                   <pic:blipFill>
-                    <a:blip r:embed="rId20"/>
+                    <a:blip r:embed="rId26"/>
                     <a:stretch>
                       <a:fillRect/>
                     </a:stretch>
@@ -930,45 +2746,13 @@
     </w:p>
     <w:p>
       <w:r>
-        <w:t xml:space="preserve">Next, I tried </w:t>
-      </w:r>
-      <w:proofErr w:type="spellStart"/>
-      <w:r>
-        <w:t>CatBoost</w:t>
-      </w:r>
-      <w:proofErr w:type="spellEnd"/>
-      <w:r>
-        <w:t>, a tree-based model that automatically handles categorical variables.</w:t>
-      </w:r>
-      <w:r>
-        <w:t xml:space="preserve"> (Also has a regression version for a continuous target variable: </w:t>
-      </w:r>
-      <w:proofErr w:type="spellStart"/>
-      <w:r>
-        <w:t>CatBoostRegressor</w:t>
-      </w:r>
-      <w:proofErr w:type="spellEnd"/>
-      <w:r>
-        <w:t>.)</w:t>
-      </w:r>
-      <w:r>
-        <w:t xml:space="preserve"> I could just throw in my merged </w:t>
-      </w:r>
-      <w:proofErr w:type="gramStart"/>
-      <w:r>
-        <w:t>dataset</w:t>
-      </w:r>
-      <w:proofErr w:type="gramEnd"/>
-      <w:r>
-        <w:t xml:space="preserve"> and it returned the features in order of importance to the prediction. (I included Animal </w:t>
-      </w:r>
-      <w:proofErr w:type="gramStart"/>
-      <w:r>
-        <w:t>ID</w:t>
-      </w:r>
-      <w:proofErr w:type="gramEnd"/>
-      <w:r>
-        <w:t xml:space="preserve"> but it could easily have been discarded due to its lack of correlation in previous tests.)</w:t>
+        <w:t>Next, I tried CatBoost, a tree-based model that automatically handles categorical variables.</w:t>
+      </w:r>
+      <w:r>
+        <w:t xml:space="preserve"> (Also has a regression version for a continuous target variable: CatBoostRegressor.)</w:t>
+      </w:r>
+      <w:r>
+        <w:t xml:space="preserve"> I could just throw in my merged dataset and it returned the features in order of importance to the prediction. (I included Animal ID but it could easily have been discarded due to its lack of correlation in previous tests.)</w:t>
       </w:r>
       <w:r>
         <w:t xml:space="preserve"> </w:t>
@@ -981,24 +2765,11 @@
       <w:r>
         <w:t xml:space="preserve">This model is 80% accurate without any hyperparameter tuning etc. </w:t>
       </w:r>
-      <w:proofErr w:type="spellStart"/>
-      <w:r>
-        <w:t>CatBoost</w:t>
-      </w:r>
-      <w:proofErr w:type="spellEnd"/>
-      <w:r>
-        <w:t xml:space="preserve"> also handles collinear variables well in predictions</w:t>
-      </w:r>
-      <w:r>
-        <w:t xml:space="preserve">, so no preprocessing </w:t>
-      </w:r>
-      <w:proofErr w:type="gramStart"/>
-      <w:r>
-        <w:t>has to</w:t>
-      </w:r>
-      <w:proofErr w:type="gramEnd"/>
-      <w:r>
-        <w:t xml:space="preserve"> be done there</w:t>
+      <w:r>
+        <w:t>CatBoost also handles collinear variables well in predictions</w:t>
+      </w:r>
+      <w:r>
+        <w:t>, so no preprocessing has to be done there</w:t>
       </w:r>
       <w:r>
         <w:t>, though collinear variables may have reduced feature importance.</w:t>
@@ -1025,7 +2796,7 @@
                     <pic:cNvPicPr/>
                   </pic:nvPicPr>
                   <pic:blipFill>
-                    <a:blip r:embed="rId21"/>
+                    <a:blip r:embed="rId27"/>
                     <a:stretch>
                       <a:fillRect/>
                     </a:stretch>
@@ -1078,7 +2849,7 @@
                     <pic:cNvPicPr/>
                   </pic:nvPicPr>
                   <pic:blipFill>
-                    <a:blip r:embed="rId22"/>
+                    <a:blip r:embed="rId28"/>
                     <a:stretch>
                       <a:fillRect/>
                     </a:stretch>
@@ -1139,15 +2910,7 @@
     </w:p>
     <w:p>
       <w:r>
-        <w:t xml:space="preserve">Then I added indirect variables and ran the chi-squared tests and </w:t>
-      </w:r>
-      <w:proofErr w:type="spellStart"/>
-      <w:r>
-        <w:t>CatBoost</w:t>
-      </w:r>
-      <w:proofErr w:type="spellEnd"/>
-      <w:r>
-        <w:t xml:space="preserve"> model again.</w:t>
+        <w:t>Then I added indirect variables and ran the chi-squared tests and CatBoost model again.</w:t>
       </w:r>
     </w:p>
     <w:p>
@@ -1172,7 +2935,7 @@
                     <pic:cNvPicPr/>
                   </pic:nvPicPr>
                   <pic:blipFill>
-                    <a:blip r:embed="rId23"/>
+                    <a:blip r:embed="rId29"/>
                     <a:stretch>
                       <a:fillRect/>
                     </a:stretch>
@@ -1214,7 +2977,7 @@
                     <pic:cNvPicPr/>
                   </pic:nvPicPr>
                   <pic:blipFill>
-                    <a:blip r:embed="rId24"/>
+                    <a:blip r:embed="rId30"/>
                     <a:stretch>
                       <a:fillRect/>
                     </a:stretch>
@@ -1239,11 +3002,9 @@
       <w:r>
         <w:t xml:space="preserve">Typically, weak associations do not have strong feature importance. Moderate to strong associations will have medium to high feature importance, but this does not always correspond to the strength of the individual </w:t>
       </w:r>
-      <w:proofErr w:type="spellStart"/>
       <w:r>
         <w:t>assocations</w:t>
       </w:r>
-      <w:proofErr w:type="spellEnd"/>
       <w:r>
         <w:t>.</w:t>
       </w:r>
@@ -1275,7 +3036,7 @@
                     <pic:cNvPicPr/>
                   </pic:nvPicPr>
                   <pic:blipFill>
-                    <a:blip r:embed="rId25"/>
+                    <a:blip r:embed="rId31"/>
                     <a:stretch>
                       <a:fillRect/>
                     </a:stretch>
@@ -1317,7 +3078,7 @@
                     <pic:cNvPicPr/>
                   </pic:nvPicPr>
                   <pic:blipFill>
-                    <a:blip r:embed="rId26"/>
+                    <a:blip r:embed="rId32"/>
                     <a:stretch>
                       <a:fillRect/>
                     </a:stretch>
@@ -1360,15 +3121,7 @@
     </w:p>
     <w:p>
       <w:r>
-        <w:t xml:space="preserve">I realized that </w:t>
-      </w:r>
-      <w:proofErr w:type="spellStart"/>
-      <w:r>
-        <w:t>CatBoost</w:t>
-      </w:r>
-      <w:proofErr w:type="spellEnd"/>
-      <w:r>
-        <w:t xml:space="preserve"> does not answer the question we are most interested in: what features are most correlated with the outcome? Instead, feature importance measures what features have the most </w:t>
+        <w:t xml:space="preserve">I realized that CatBoost does not answer the question we are most interested in: what features are most correlated with the outcome? Instead, feature importance measures what features have the most </w:t>
       </w:r>
       <w:r>
         <w:rPr>
@@ -1378,15 +3131,7 @@
         <w:t>predictive</w:t>
       </w:r>
       <w:r>
-        <w:t xml:space="preserve"> importance. Even if we have 10 useless features, feature importance will still assign them some weight. </w:t>
-      </w:r>
-      <w:proofErr w:type="spellStart"/>
-      <w:r>
-        <w:t>CatBoost</w:t>
-      </w:r>
-      <w:proofErr w:type="spellEnd"/>
-      <w:r>
-        <w:t xml:space="preserve"> is a better candidate model for predictions, but Logistic Regression would still be best for examining multicollinearity w/ categorical target variables.  </w:t>
+        <w:t xml:space="preserve"> importance. Even if we have 10 useless features, feature importance will still assign them some weight. CatBoost is a better candidate model for predictions, but Logistic Regression would still be best for examining multicollinearity w/ categorical target variables.  </w:t>
       </w:r>
     </w:p>
     <w:p>
@@ -1449,7 +3194,7 @@
                     <pic:cNvPicPr/>
                   </pic:nvPicPr>
                   <pic:blipFill>
-                    <a:blip r:embed="rId27"/>
+                    <a:blip r:embed="rId33"/>
                     <a:stretch>
                       <a:fillRect/>
                     </a:stretch>
@@ -1495,7 +3240,7 @@
                     <pic:cNvPicPr/>
                   </pic:nvPicPr>
                   <pic:blipFill>
-                    <a:blip r:embed="rId28"/>
+                    <a:blip r:embed="rId34"/>
                     <a:stretch>
                       <a:fillRect/>
                     </a:stretch>
@@ -1537,7 +3282,7 @@
                     <pic:cNvPicPr/>
                   </pic:nvPicPr>
                   <pic:blipFill>
-                    <a:blip r:embed="rId29"/>
+                    <a:blip r:embed="rId35"/>
                     <a:stretch>
                       <a:fillRect/>
                     </a:stretch>
@@ -1644,13 +3389,8 @@
           <w:numId w:val="4"/>
         </w:numPr>
       </w:pPr>
-      <w:proofErr w:type="spellStart"/>
-      <w:r>
-        <w:t>Beeswarm</w:t>
-      </w:r>
-      <w:proofErr w:type="spellEnd"/>
-      <w:r>
-        <w:t xml:space="preserve"> plots: break down feature importance for each outcome category</w:t>
+      <w:r>
+        <w:t>Beeswarm plots: break down feature importance for each outcome category</w:t>
       </w:r>
     </w:p>
     <w:p>
@@ -1725,15 +3465,7 @@
       </w:pPr>
       <w:r>
         <w:lastRenderedPageBreak/>
-        <w:t xml:space="preserve">Then can </w:t>
-      </w:r>
-      <w:proofErr w:type="gramStart"/>
-      <w:r>
-        <w:t>look into</w:t>
-      </w:r>
-      <w:proofErr w:type="gramEnd"/>
-      <w:r>
-        <w:t xml:space="preserve"> each PC to determine what groups of variables were found most important</w:t>
+        <w:t>Then can look into each PC to determine what groups of variables were found most important</w:t>
       </w:r>
     </w:p>
     <w:p>
@@ -1863,15 +3595,7 @@
         </w:numPr>
       </w:pPr>
       <w:r>
-        <w:t>Degrees of freedom: (rows – 1) * (</w:t>
-      </w:r>
-      <w:proofErr w:type="gramStart"/>
-      <w:r>
-        <w:t>columns</w:t>
-      </w:r>
-      <w:proofErr w:type="gramEnd"/>
-      <w:r>
-        <w:t xml:space="preserve"> – 1)</w:t>
+        <w:t>Degrees of freedom: (rows – 1) * (columns – 1)</w:t>
       </w:r>
     </w:p>
     <w:p>
@@ -2259,23 +3983,7 @@
           <w:i/>
           <w:iCs/>
         </w:rPr>
-        <w:t xml:space="preserve">PROMPT: Now, I want to know what of the variables might be the best candidates for variables highly correlated with the target. You do not need to write code, just give me </w:t>
-      </w:r>
-      <w:proofErr w:type="gramStart"/>
-      <w:r>
-        <w:rPr>
-          <w:i/>
-          <w:iCs/>
-        </w:rPr>
-        <w:t>your</w:t>
-      </w:r>
-      <w:proofErr w:type="gramEnd"/>
-      <w:r>
-        <w:rPr>
-          <w:i/>
-          <w:iCs/>
-        </w:rPr>
-        <w:t xml:space="preserve"> reasoning via text. You can select existing variables and combine variables as well to create new ones.</w:t>
+        <w:t>PROMPT: Now, I want to know what of the variables might be the best candidates for variables highly correlated with the target. You do not need to write code, just give me your reasoning via text. You can select existing variables and combine variables as well to create new ones.</w:t>
       </w:r>
     </w:p>
     <w:p>
@@ -2337,6 +4045,493 @@
 <file path=word/numbering.xml><?xml version="1.0" encoding="utf-8"?>
 <w:numbering xmlns:wpc="http://schemas.microsoft.com/office/word/2010/wordprocessingCanvas" xmlns:cx="http://schemas.microsoft.com/office/drawing/2014/chartex" xmlns:cx1="http://schemas.microsoft.com/office/drawing/2015/9/8/chartex" xmlns:cx2="http://schemas.microsoft.com/office/drawing/2015/10/21/chartex" xmlns:cx3="http://schemas.microsoft.com/office/drawing/2016/5/9/chartex" xmlns:cx4="http://schemas.microsoft.com/office/drawing/2016/5/10/chartex" xmlns:cx5="http://schemas.microsoft.com/office/drawing/2016/5/11/chartex" xmlns:cx6="http://schemas.microsoft.com/office/drawing/2016/5/12/chartex" xmlns:cx7="http://schemas.microsoft.com/office/drawing/2016/5/13/chartex" xmlns:cx8="http://schemas.microsoft.com/office/drawing/2016/5/14/chartex" xmlns:mc="http://schemas.openxmlformats.org/markup-compatibility/2006" xmlns:aink="http://schemas.microsoft.com/office/drawing/2016/ink" xmlns:am3d="http://schemas.microsoft.com/office/drawing/2017/model3d" xmlns:o="urn:schemas-microsoft-com:office:office" xmlns:oel="http://schemas.microsoft.com/office/2019/extlst" xmlns:r="http://schemas.openxmlformats.org/officeDocument/2006/relationships" xmlns:m="http://schemas.openxmlformats.org/officeDocument/2006/math" xmlns:v="urn:schemas-microsoft-com:vml" xmlns:wp14="http://schemas.microsoft.com/office/word/2010/wordprocessingDrawing" xmlns:wp="http://schemas.openxmlformats.org/drawingml/2006/wordprocessingDrawing" xmlns:w10="urn:schemas-microsoft-com:office:word" xmlns:w="http://schemas.openxmlformats.org/wordprocessingml/2006/main" xmlns:w14="http://schemas.microsoft.com/office/word/2010/wordml" xmlns:w15="http://schemas.microsoft.com/office/word/2012/wordml" xmlns:w16cex="http://schemas.microsoft.com/office/word/2018/wordml/cex" xmlns:w16cid="http://schemas.microsoft.com/office/word/2016/wordml/cid" xmlns:w16="http://schemas.microsoft.com/office/word/2018/wordml" xmlns:w16du="http://schemas.microsoft.com/office/word/2023/wordml/word16du" xmlns:w16sdtdh="http://schemas.microsoft.com/office/word/2020/wordml/sdtdatahash" xmlns:w16se="http://schemas.microsoft.com/office/word/2015/wordml/symex" xmlns:wpg="http://schemas.microsoft.com/office/word/2010/wordprocessingGroup" xmlns:wpi="http://schemas.microsoft.com/office/word/2010/wordprocessingInk" xmlns:wne="http://schemas.microsoft.com/office/word/2006/wordml" xmlns:wps="http://schemas.microsoft.com/office/word/2010/wordprocessingShape" mc:Ignorable="w14 w15 w16se w16cid w16 w16cex w16sdtdh w16du wp14">
   <w:abstractNum w:abstractNumId="0" w15:restartNumberingAfterBreak="0">
+    <w:nsid w:val="007C3FA4"/>
+    <w:multiLevelType w:val="multilevel"/>
+    <w:tmpl w:val="5C8A73D2"/>
+    <w:lvl w:ilvl="0">
+      <w:start w:val="1"/>
+      <w:numFmt w:val="decimal"/>
+      <w:lvlText w:val="%1."/>
+      <w:lvlJc w:val="left"/>
+      <w:pPr>
+        <w:tabs>
+          <w:tab w:val="num" w:pos="720"/>
+        </w:tabs>
+        <w:ind w:left="720" w:hanging="360"/>
+      </w:pPr>
+    </w:lvl>
+    <w:lvl w:ilvl="1" w:tentative="1">
+      <w:start w:val="1"/>
+      <w:numFmt w:val="decimal"/>
+      <w:lvlText w:val="%2."/>
+      <w:lvlJc w:val="left"/>
+      <w:pPr>
+        <w:tabs>
+          <w:tab w:val="num" w:pos="1440"/>
+        </w:tabs>
+        <w:ind w:left="1440" w:hanging="360"/>
+      </w:pPr>
+    </w:lvl>
+    <w:lvl w:ilvl="2" w:tentative="1">
+      <w:start w:val="1"/>
+      <w:numFmt w:val="decimal"/>
+      <w:lvlText w:val="%3."/>
+      <w:lvlJc w:val="left"/>
+      <w:pPr>
+        <w:tabs>
+          <w:tab w:val="num" w:pos="2160"/>
+        </w:tabs>
+        <w:ind w:left="2160" w:hanging="360"/>
+      </w:pPr>
+    </w:lvl>
+    <w:lvl w:ilvl="3" w:tentative="1">
+      <w:start w:val="1"/>
+      <w:numFmt w:val="decimal"/>
+      <w:lvlText w:val="%4."/>
+      <w:lvlJc w:val="left"/>
+      <w:pPr>
+        <w:tabs>
+          <w:tab w:val="num" w:pos="2880"/>
+        </w:tabs>
+        <w:ind w:left="2880" w:hanging="360"/>
+      </w:pPr>
+    </w:lvl>
+    <w:lvl w:ilvl="4" w:tentative="1">
+      <w:start w:val="1"/>
+      <w:numFmt w:val="decimal"/>
+      <w:lvlText w:val="%5."/>
+      <w:lvlJc w:val="left"/>
+      <w:pPr>
+        <w:tabs>
+          <w:tab w:val="num" w:pos="3600"/>
+        </w:tabs>
+        <w:ind w:left="3600" w:hanging="360"/>
+      </w:pPr>
+    </w:lvl>
+    <w:lvl w:ilvl="5" w:tentative="1">
+      <w:start w:val="1"/>
+      <w:numFmt w:val="decimal"/>
+      <w:lvlText w:val="%6."/>
+      <w:lvlJc w:val="left"/>
+      <w:pPr>
+        <w:tabs>
+          <w:tab w:val="num" w:pos="4320"/>
+        </w:tabs>
+        <w:ind w:left="4320" w:hanging="360"/>
+      </w:pPr>
+    </w:lvl>
+    <w:lvl w:ilvl="6" w:tentative="1">
+      <w:start w:val="1"/>
+      <w:numFmt w:val="decimal"/>
+      <w:lvlText w:val="%7."/>
+      <w:lvlJc w:val="left"/>
+      <w:pPr>
+        <w:tabs>
+          <w:tab w:val="num" w:pos="5040"/>
+        </w:tabs>
+        <w:ind w:left="5040" w:hanging="360"/>
+      </w:pPr>
+    </w:lvl>
+    <w:lvl w:ilvl="7" w:tentative="1">
+      <w:start w:val="1"/>
+      <w:numFmt w:val="decimal"/>
+      <w:lvlText w:val="%8."/>
+      <w:lvlJc w:val="left"/>
+      <w:pPr>
+        <w:tabs>
+          <w:tab w:val="num" w:pos="5760"/>
+        </w:tabs>
+        <w:ind w:left="5760" w:hanging="360"/>
+      </w:pPr>
+    </w:lvl>
+    <w:lvl w:ilvl="8" w:tentative="1">
+      <w:start w:val="1"/>
+      <w:numFmt w:val="decimal"/>
+      <w:lvlText w:val="%9."/>
+      <w:lvlJc w:val="left"/>
+      <w:pPr>
+        <w:tabs>
+          <w:tab w:val="num" w:pos="6480"/>
+        </w:tabs>
+        <w:ind w:left="6480" w:hanging="360"/>
+      </w:pPr>
+    </w:lvl>
+  </w:abstractNum>
+  <w:abstractNum w:abstractNumId="1" w15:restartNumberingAfterBreak="0">
+    <w:nsid w:val="08B40BA6"/>
+    <w:multiLevelType w:val="multilevel"/>
+    <w:tmpl w:val="143A4656"/>
+    <w:lvl w:ilvl="0">
+      <w:start w:val="1"/>
+      <w:numFmt w:val="decimal"/>
+      <w:lvlText w:val="%1."/>
+      <w:lvlJc w:val="left"/>
+      <w:pPr>
+        <w:tabs>
+          <w:tab w:val="num" w:pos="720"/>
+        </w:tabs>
+        <w:ind w:left="720" w:hanging="360"/>
+      </w:pPr>
+    </w:lvl>
+    <w:lvl w:ilvl="1" w:tentative="1">
+      <w:start w:val="1"/>
+      <w:numFmt w:val="decimal"/>
+      <w:lvlText w:val="%2."/>
+      <w:lvlJc w:val="left"/>
+      <w:pPr>
+        <w:tabs>
+          <w:tab w:val="num" w:pos="1440"/>
+        </w:tabs>
+        <w:ind w:left="1440" w:hanging="360"/>
+      </w:pPr>
+    </w:lvl>
+    <w:lvl w:ilvl="2" w:tentative="1">
+      <w:start w:val="1"/>
+      <w:numFmt w:val="decimal"/>
+      <w:lvlText w:val="%3."/>
+      <w:lvlJc w:val="left"/>
+      <w:pPr>
+        <w:tabs>
+          <w:tab w:val="num" w:pos="2160"/>
+        </w:tabs>
+        <w:ind w:left="2160" w:hanging="360"/>
+      </w:pPr>
+    </w:lvl>
+    <w:lvl w:ilvl="3" w:tentative="1">
+      <w:start w:val="1"/>
+      <w:numFmt w:val="decimal"/>
+      <w:lvlText w:val="%4."/>
+      <w:lvlJc w:val="left"/>
+      <w:pPr>
+        <w:tabs>
+          <w:tab w:val="num" w:pos="2880"/>
+        </w:tabs>
+        <w:ind w:left="2880" w:hanging="360"/>
+      </w:pPr>
+    </w:lvl>
+    <w:lvl w:ilvl="4" w:tentative="1">
+      <w:start w:val="1"/>
+      <w:numFmt w:val="decimal"/>
+      <w:lvlText w:val="%5."/>
+      <w:lvlJc w:val="left"/>
+      <w:pPr>
+        <w:tabs>
+          <w:tab w:val="num" w:pos="3600"/>
+        </w:tabs>
+        <w:ind w:left="3600" w:hanging="360"/>
+      </w:pPr>
+    </w:lvl>
+    <w:lvl w:ilvl="5" w:tentative="1">
+      <w:start w:val="1"/>
+      <w:numFmt w:val="decimal"/>
+      <w:lvlText w:val="%6."/>
+      <w:lvlJc w:val="left"/>
+      <w:pPr>
+        <w:tabs>
+          <w:tab w:val="num" w:pos="4320"/>
+        </w:tabs>
+        <w:ind w:left="4320" w:hanging="360"/>
+      </w:pPr>
+    </w:lvl>
+    <w:lvl w:ilvl="6" w:tentative="1">
+      <w:start w:val="1"/>
+      <w:numFmt w:val="decimal"/>
+      <w:lvlText w:val="%7."/>
+      <w:lvlJc w:val="left"/>
+      <w:pPr>
+        <w:tabs>
+          <w:tab w:val="num" w:pos="5040"/>
+        </w:tabs>
+        <w:ind w:left="5040" w:hanging="360"/>
+      </w:pPr>
+    </w:lvl>
+    <w:lvl w:ilvl="7" w:tentative="1">
+      <w:start w:val="1"/>
+      <w:numFmt w:val="decimal"/>
+      <w:lvlText w:val="%8."/>
+      <w:lvlJc w:val="left"/>
+      <w:pPr>
+        <w:tabs>
+          <w:tab w:val="num" w:pos="5760"/>
+        </w:tabs>
+        <w:ind w:left="5760" w:hanging="360"/>
+      </w:pPr>
+    </w:lvl>
+    <w:lvl w:ilvl="8" w:tentative="1">
+      <w:start w:val="1"/>
+      <w:numFmt w:val="decimal"/>
+      <w:lvlText w:val="%9."/>
+      <w:lvlJc w:val="left"/>
+      <w:pPr>
+        <w:tabs>
+          <w:tab w:val="num" w:pos="6480"/>
+        </w:tabs>
+        <w:ind w:left="6480" w:hanging="360"/>
+      </w:pPr>
+    </w:lvl>
+  </w:abstractNum>
+  <w:abstractNum w:abstractNumId="2" w15:restartNumberingAfterBreak="0">
+    <w:nsid w:val="0BEF1409"/>
+    <w:multiLevelType w:val="multilevel"/>
+    <w:tmpl w:val="C8C0EC32"/>
+    <w:lvl w:ilvl="0">
+      <w:start w:val="1"/>
+      <w:numFmt w:val="bullet"/>
+      <w:lvlText w:val=""/>
+      <w:lvlJc w:val="left"/>
+      <w:pPr>
+        <w:tabs>
+          <w:tab w:val="num" w:pos="720"/>
+        </w:tabs>
+        <w:ind w:left="720" w:hanging="360"/>
+      </w:pPr>
+      <w:rPr>
+        <w:rFonts w:ascii="Symbol" w:hAnsi="Symbol" w:hint="default"/>
+        <w:sz w:val="20"/>
+      </w:rPr>
+    </w:lvl>
+    <w:lvl w:ilvl="1" w:tentative="1">
+      <w:start w:val="1"/>
+      <w:numFmt w:val="bullet"/>
+      <w:lvlText w:val="o"/>
+      <w:lvlJc w:val="left"/>
+      <w:pPr>
+        <w:tabs>
+          <w:tab w:val="num" w:pos="1440"/>
+        </w:tabs>
+        <w:ind w:left="1440" w:hanging="360"/>
+      </w:pPr>
+      <w:rPr>
+        <w:rFonts w:ascii="Courier New" w:hAnsi="Courier New" w:hint="default"/>
+        <w:sz w:val="20"/>
+      </w:rPr>
+    </w:lvl>
+    <w:lvl w:ilvl="2" w:tentative="1">
+      <w:start w:val="1"/>
+      <w:numFmt w:val="bullet"/>
+      <w:lvlText w:val=""/>
+      <w:lvlJc w:val="left"/>
+      <w:pPr>
+        <w:tabs>
+          <w:tab w:val="num" w:pos="2160"/>
+        </w:tabs>
+        <w:ind w:left="2160" w:hanging="360"/>
+      </w:pPr>
+      <w:rPr>
+        <w:rFonts w:ascii="Wingdings" w:hAnsi="Wingdings" w:hint="default"/>
+        <w:sz w:val="20"/>
+      </w:rPr>
+    </w:lvl>
+    <w:lvl w:ilvl="3" w:tentative="1">
+      <w:start w:val="1"/>
+      <w:numFmt w:val="bullet"/>
+      <w:lvlText w:val=""/>
+      <w:lvlJc w:val="left"/>
+      <w:pPr>
+        <w:tabs>
+          <w:tab w:val="num" w:pos="2880"/>
+        </w:tabs>
+        <w:ind w:left="2880" w:hanging="360"/>
+      </w:pPr>
+      <w:rPr>
+        <w:rFonts w:ascii="Wingdings" w:hAnsi="Wingdings" w:hint="default"/>
+        <w:sz w:val="20"/>
+      </w:rPr>
+    </w:lvl>
+    <w:lvl w:ilvl="4" w:tentative="1">
+      <w:start w:val="1"/>
+      <w:numFmt w:val="bullet"/>
+      <w:lvlText w:val=""/>
+      <w:lvlJc w:val="left"/>
+      <w:pPr>
+        <w:tabs>
+          <w:tab w:val="num" w:pos="3600"/>
+        </w:tabs>
+        <w:ind w:left="3600" w:hanging="360"/>
+      </w:pPr>
+      <w:rPr>
+        <w:rFonts w:ascii="Wingdings" w:hAnsi="Wingdings" w:hint="default"/>
+        <w:sz w:val="20"/>
+      </w:rPr>
+    </w:lvl>
+    <w:lvl w:ilvl="5" w:tentative="1">
+      <w:start w:val="1"/>
+      <w:numFmt w:val="bullet"/>
+      <w:lvlText w:val=""/>
+      <w:lvlJc w:val="left"/>
+      <w:pPr>
+        <w:tabs>
+          <w:tab w:val="num" w:pos="4320"/>
+        </w:tabs>
+        <w:ind w:left="4320" w:hanging="360"/>
+      </w:pPr>
+      <w:rPr>
+        <w:rFonts w:ascii="Wingdings" w:hAnsi="Wingdings" w:hint="default"/>
+        <w:sz w:val="20"/>
+      </w:rPr>
+    </w:lvl>
+    <w:lvl w:ilvl="6" w:tentative="1">
+      <w:start w:val="1"/>
+      <w:numFmt w:val="bullet"/>
+      <w:lvlText w:val=""/>
+      <w:lvlJc w:val="left"/>
+      <w:pPr>
+        <w:tabs>
+          <w:tab w:val="num" w:pos="5040"/>
+        </w:tabs>
+        <w:ind w:left="5040" w:hanging="360"/>
+      </w:pPr>
+      <w:rPr>
+        <w:rFonts w:ascii="Wingdings" w:hAnsi="Wingdings" w:hint="default"/>
+        <w:sz w:val="20"/>
+      </w:rPr>
+    </w:lvl>
+    <w:lvl w:ilvl="7" w:tentative="1">
+      <w:start w:val="1"/>
+      <w:numFmt w:val="bullet"/>
+      <w:lvlText w:val=""/>
+      <w:lvlJc w:val="left"/>
+      <w:pPr>
+        <w:tabs>
+          <w:tab w:val="num" w:pos="5760"/>
+        </w:tabs>
+        <w:ind w:left="5760" w:hanging="360"/>
+      </w:pPr>
+      <w:rPr>
+        <w:rFonts w:ascii="Wingdings" w:hAnsi="Wingdings" w:hint="default"/>
+        <w:sz w:val="20"/>
+      </w:rPr>
+    </w:lvl>
+    <w:lvl w:ilvl="8" w:tentative="1">
+      <w:start w:val="1"/>
+      <w:numFmt w:val="bullet"/>
+      <w:lvlText w:val=""/>
+      <w:lvlJc w:val="left"/>
+      <w:pPr>
+        <w:tabs>
+          <w:tab w:val="num" w:pos="6480"/>
+        </w:tabs>
+        <w:ind w:left="6480" w:hanging="360"/>
+      </w:pPr>
+      <w:rPr>
+        <w:rFonts w:ascii="Wingdings" w:hAnsi="Wingdings" w:hint="default"/>
+        <w:sz w:val="20"/>
+      </w:rPr>
+    </w:lvl>
+  </w:abstractNum>
+  <w:abstractNum w:abstractNumId="3" w15:restartNumberingAfterBreak="0">
+    <w:nsid w:val="22140E01"/>
+    <w:multiLevelType w:val="hybridMultilevel"/>
+    <w:tmpl w:val="43DCC49A"/>
+    <w:lvl w:ilvl="0" w:tplc="F184F7A6">
+      <w:numFmt w:val="bullet"/>
+      <w:lvlText w:val="-"/>
+      <w:lvlJc w:val="left"/>
+      <w:pPr>
+        <w:ind w:left="720" w:hanging="360"/>
+      </w:pPr>
+      <w:rPr>
+        <w:rFonts w:ascii="Aptos" w:eastAsiaTheme="minorHAnsi" w:hAnsi="Aptos" w:cstheme="minorBidi" w:hint="default"/>
+      </w:rPr>
+    </w:lvl>
+    <w:lvl w:ilvl="1" w:tplc="04090003">
+      <w:start w:val="1"/>
+      <w:numFmt w:val="bullet"/>
+      <w:lvlText w:val="o"/>
+      <w:lvlJc w:val="left"/>
+      <w:pPr>
+        <w:ind w:left="1440" w:hanging="360"/>
+      </w:pPr>
+      <w:rPr>
+        <w:rFonts w:ascii="Courier New" w:hAnsi="Courier New" w:cs="Courier New" w:hint="default"/>
+      </w:rPr>
+    </w:lvl>
+    <w:lvl w:ilvl="2" w:tplc="04090005" w:tentative="1">
+      <w:start w:val="1"/>
+      <w:numFmt w:val="bullet"/>
+      <w:lvlText w:val=""/>
+      <w:lvlJc w:val="left"/>
+      <w:pPr>
+        <w:ind w:left="2160" w:hanging="360"/>
+      </w:pPr>
+      <w:rPr>
+        <w:rFonts w:ascii="Wingdings" w:hAnsi="Wingdings" w:hint="default"/>
+      </w:rPr>
+    </w:lvl>
+    <w:lvl w:ilvl="3" w:tplc="04090001" w:tentative="1">
+      <w:start w:val="1"/>
+      <w:numFmt w:val="bullet"/>
+      <w:lvlText w:val=""/>
+      <w:lvlJc w:val="left"/>
+      <w:pPr>
+        <w:ind w:left="2880" w:hanging="360"/>
+      </w:pPr>
+      <w:rPr>
+        <w:rFonts w:ascii="Symbol" w:hAnsi="Symbol" w:hint="default"/>
+      </w:rPr>
+    </w:lvl>
+    <w:lvl w:ilvl="4" w:tplc="04090003" w:tentative="1">
+      <w:start w:val="1"/>
+      <w:numFmt w:val="bullet"/>
+      <w:lvlText w:val="o"/>
+      <w:lvlJc w:val="left"/>
+      <w:pPr>
+        <w:ind w:left="3600" w:hanging="360"/>
+      </w:pPr>
+      <w:rPr>
+        <w:rFonts w:ascii="Courier New" w:hAnsi="Courier New" w:cs="Courier New" w:hint="default"/>
+      </w:rPr>
+    </w:lvl>
+    <w:lvl w:ilvl="5" w:tplc="04090005" w:tentative="1">
+      <w:start w:val="1"/>
+      <w:numFmt w:val="bullet"/>
+      <w:lvlText w:val=""/>
+      <w:lvlJc w:val="left"/>
+      <w:pPr>
+        <w:ind w:left="4320" w:hanging="360"/>
+      </w:pPr>
+      <w:rPr>
+        <w:rFonts w:ascii="Wingdings" w:hAnsi="Wingdings" w:hint="default"/>
+      </w:rPr>
+    </w:lvl>
+    <w:lvl w:ilvl="6" w:tplc="04090001" w:tentative="1">
+      <w:start w:val="1"/>
+      <w:numFmt w:val="bullet"/>
+      <w:lvlText w:val=""/>
+      <w:lvlJc w:val="left"/>
+      <w:pPr>
+        <w:ind w:left="5040" w:hanging="360"/>
+      </w:pPr>
+      <w:rPr>
+        <w:rFonts w:ascii="Symbol" w:hAnsi="Symbol" w:hint="default"/>
+      </w:rPr>
+    </w:lvl>
+    <w:lvl w:ilvl="7" w:tplc="04090003" w:tentative="1">
+      <w:start w:val="1"/>
+      <w:numFmt w:val="bullet"/>
+      <w:lvlText w:val="o"/>
+      <w:lvlJc w:val="left"/>
+      <w:pPr>
+        <w:ind w:left="5760" w:hanging="360"/>
+      </w:pPr>
+      <w:rPr>
+        <w:rFonts w:ascii="Courier New" w:hAnsi="Courier New" w:cs="Courier New" w:hint="default"/>
+      </w:rPr>
+    </w:lvl>
+    <w:lvl w:ilvl="8" w:tplc="04090005" w:tentative="1">
+      <w:start w:val="1"/>
+      <w:numFmt w:val="bullet"/>
+      <w:lvlText w:val=""/>
+      <w:lvlJc w:val="left"/>
+      <w:pPr>
+        <w:ind w:left="6480" w:hanging="360"/>
+      </w:pPr>
+      <w:rPr>
+        <w:rFonts w:ascii="Wingdings" w:hAnsi="Wingdings" w:hint="default"/>
+      </w:rPr>
+    </w:lvl>
+  </w:abstractNum>
+  <w:abstractNum w:abstractNumId="4" w15:restartNumberingAfterBreak="0">
     <w:nsid w:val="2C5C124D"/>
     <w:multiLevelType w:val="hybridMultilevel"/>
     <w:tmpl w:val="F9E4600E"/>
@@ -2448,7 +4643,7 @@
       </w:rPr>
     </w:lvl>
   </w:abstractNum>
-  <w:abstractNum w:abstractNumId="1" w15:restartNumberingAfterBreak="0">
+  <w:abstractNum w:abstractNumId="5" w15:restartNumberingAfterBreak="0">
     <w:nsid w:val="3B7E1A3B"/>
     <w:multiLevelType w:val="hybridMultilevel"/>
     <w:tmpl w:val="7C0C5DF8"/>
@@ -2560,7 +4755,156 @@
       </w:rPr>
     </w:lvl>
   </w:abstractNum>
-  <w:abstractNum w:abstractNumId="2" w15:restartNumberingAfterBreak="0">
+  <w:abstractNum w:abstractNumId="6" w15:restartNumberingAfterBreak="0">
+    <w:nsid w:val="449C66B7"/>
+    <w:multiLevelType w:val="multilevel"/>
+    <w:tmpl w:val="855A6532"/>
+    <w:lvl w:ilvl="0">
+      <w:start w:val="1"/>
+      <w:numFmt w:val="bullet"/>
+      <w:lvlText w:val=""/>
+      <w:lvlJc w:val="left"/>
+      <w:pPr>
+        <w:tabs>
+          <w:tab w:val="num" w:pos="720"/>
+        </w:tabs>
+        <w:ind w:left="720" w:hanging="360"/>
+      </w:pPr>
+      <w:rPr>
+        <w:rFonts w:ascii="Symbol" w:hAnsi="Symbol" w:hint="default"/>
+        <w:sz w:val="20"/>
+      </w:rPr>
+    </w:lvl>
+    <w:lvl w:ilvl="1" w:tentative="1">
+      <w:start w:val="1"/>
+      <w:numFmt w:val="bullet"/>
+      <w:lvlText w:val="o"/>
+      <w:lvlJc w:val="left"/>
+      <w:pPr>
+        <w:tabs>
+          <w:tab w:val="num" w:pos="1440"/>
+        </w:tabs>
+        <w:ind w:left="1440" w:hanging="360"/>
+      </w:pPr>
+      <w:rPr>
+        <w:rFonts w:ascii="Courier New" w:hAnsi="Courier New" w:hint="default"/>
+        <w:sz w:val="20"/>
+      </w:rPr>
+    </w:lvl>
+    <w:lvl w:ilvl="2" w:tentative="1">
+      <w:start w:val="1"/>
+      <w:numFmt w:val="bullet"/>
+      <w:lvlText w:val=""/>
+      <w:lvlJc w:val="left"/>
+      <w:pPr>
+        <w:tabs>
+          <w:tab w:val="num" w:pos="2160"/>
+        </w:tabs>
+        <w:ind w:left="2160" w:hanging="360"/>
+      </w:pPr>
+      <w:rPr>
+        <w:rFonts w:ascii="Wingdings" w:hAnsi="Wingdings" w:hint="default"/>
+        <w:sz w:val="20"/>
+      </w:rPr>
+    </w:lvl>
+    <w:lvl w:ilvl="3" w:tentative="1">
+      <w:start w:val="1"/>
+      <w:numFmt w:val="bullet"/>
+      <w:lvlText w:val=""/>
+      <w:lvlJc w:val="left"/>
+      <w:pPr>
+        <w:tabs>
+          <w:tab w:val="num" w:pos="2880"/>
+        </w:tabs>
+        <w:ind w:left="2880" w:hanging="360"/>
+      </w:pPr>
+      <w:rPr>
+        <w:rFonts w:ascii="Wingdings" w:hAnsi="Wingdings" w:hint="default"/>
+        <w:sz w:val="20"/>
+      </w:rPr>
+    </w:lvl>
+    <w:lvl w:ilvl="4" w:tentative="1">
+      <w:start w:val="1"/>
+      <w:numFmt w:val="bullet"/>
+      <w:lvlText w:val=""/>
+      <w:lvlJc w:val="left"/>
+      <w:pPr>
+        <w:tabs>
+          <w:tab w:val="num" w:pos="3600"/>
+        </w:tabs>
+        <w:ind w:left="3600" w:hanging="360"/>
+      </w:pPr>
+      <w:rPr>
+        <w:rFonts w:ascii="Wingdings" w:hAnsi="Wingdings" w:hint="default"/>
+        <w:sz w:val="20"/>
+      </w:rPr>
+    </w:lvl>
+    <w:lvl w:ilvl="5" w:tentative="1">
+      <w:start w:val="1"/>
+      <w:numFmt w:val="bullet"/>
+      <w:lvlText w:val=""/>
+      <w:lvlJc w:val="left"/>
+      <w:pPr>
+        <w:tabs>
+          <w:tab w:val="num" w:pos="4320"/>
+        </w:tabs>
+        <w:ind w:left="4320" w:hanging="360"/>
+      </w:pPr>
+      <w:rPr>
+        <w:rFonts w:ascii="Wingdings" w:hAnsi="Wingdings" w:hint="default"/>
+        <w:sz w:val="20"/>
+      </w:rPr>
+    </w:lvl>
+    <w:lvl w:ilvl="6" w:tentative="1">
+      <w:start w:val="1"/>
+      <w:numFmt w:val="bullet"/>
+      <w:lvlText w:val=""/>
+      <w:lvlJc w:val="left"/>
+      <w:pPr>
+        <w:tabs>
+          <w:tab w:val="num" w:pos="5040"/>
+        </w:tabs>
+        <w:ind w:left="5040" w:hanging="360"/>
+      </w:pPr>
+      <w:rPr>
+        <w:rFonts w:ascii="Wingdings" w:hAnsi="Wingdings" w:hint="default"/>
+        <w:sz w:val="20"/>
+      </w:rPr>
+    </w:lvl>
+    <w:lvl w:ilvl="7" w:tentative="1">
+      <w:start w:val="1"/>
+      <w:numFmt w:val="bullet"/>
+      <w:lvlText w:val=""/>
+      <w:lvlJc w:val="left"/>
+      <w:pPr>
+        <w:tabs>
+          <w:tab w:val="num" w:pos="5760"/>
+        </w:tabs>
+        <w:ind w:left="5760" w:hanging="360"/>
+      </w:pPr>
+      <w:rPr>
+        <w:rFonts w:ascii="Wingdings" w:hAnsi="Wingdings" w:hint="default"/>
+        <w:sz w:val="20"/>
+      </w:rPr>
+    </w:lvl>
+    <w:lvl w:ilvl="8" w:tentative="1">
+      <w:start w:val="1"/>
+      <w:numFmt w:val="bullet"/>
+      <w:lvlText w:val=""/>
+      <w:lvlJc w:val="left"/>
+      <w:pPr>
+        <w:tabs>
+          <w:tab w:val="num" w:pos="6480"/>
+        </w:tabs>
+        <w:ind w:left="6480" w:hanging="360"/>
+      </w:pPr>
+      <w:rPr>
+        <w:rFonts w:ascii="Wingdings" w:hAnsi="Wingdings" w:hint="default"/>
+        <w:sz w:val="20"/>
+      </w:rPr>
+    </w:lvl>
+  </w:abstractNum>
+  <w:abstractNum w:abstractNumId="7" w15:restartNumberingAfterBreak="0">
     <w:nsid w:val="44F07783"/>
     <w:multiLevelType w:val="hybridMultilevel"/>
     <w:tmpl w:val="B18CE11C"/>
@@ -2672,7 +5016,417 @@
       </w:rPr>
     </w:lvl>
   </w:abstractNum>
-  <w:abstractNum w:abstractNumId="3" w15:restartNumberingAfterBreak="0">
+  <w:abstractNum w:abstractNumId="8" w15:restartNumberingAfterBreak="0">
+    <w:nsid w:val="4C075BBD"/>
+    <w:multiLevelType w:val="multilevel"/>
+    <w:tmpl w:val="6DFCF51A"/>
+    <w:lvl w:ilvl="0">
+      <w:start w:val="1"/>
+      <w:numFmt w:val="bullet"/>
+      <w:lvlText w:val=""/>
+      <w:lvlJc w:val="left"/>
+      <w:pPr>
+        <w:tabs>
+          <w:tab w:val="num" w:pos="720"/>
+        </w:tabs>
+        <w:ind w:left="720" w:hanging="360"/>
+      </w:pPr>
+      <w:rPr>
+        <w:rFonts w:ascii="Symbol" w:hAnsi="Symbol" w:hint="default"/>
+        <w:sz w:val="20"/>
+      </w:rPr>
+    </w:lvl>
+    <w:lvl w:ilvl="1" w:tentative="1">
+      <w:start w:val="1"/>
+      <w:numFmt w:val="bullet"/>
+      <w:lvlText w:val="o"/>
+      <w:lvlJc w:val="left"/>
+      <w:pPr>
+        <w:tabs>
+          <w:tab w:val="num" w:pos="1440"/>
+        </w:tabs>
+        <w:ind w:left="1440" w:hanging="360"/>
+      </w:pPr>
+      <w:rPr>
+        <w:rFonts w:ascii="Courier New" w:hAnsi="Courier New" w:hint="default"/>
+        <w:sz w:val="20"/>
+      </w:rPr>
+    </w:lvl>
+    <w:lvl w:ilvl="2" w:tentative="1">
+      <w:start w:val="1"/>
+      <w:numFmt w:val="bullet"/>
+      <w:lvlText w:val=""/>
+      <w:lvlJc w:val="left"/>
+      <w:pPr>
+        <w:tabs>
+          <w:tab w:val="num" w:pos="2160"/>
+        </w:tabs>
+        <w:ind w:left="2160" w:hanging="360"/>
+      </w:pPr>
+      <w:rPr>
+        <w:rFonts w:ascii="Wingdings" w:hAnsi="Wingdings" w:hint="default"/>
+        <w:sz w:val="20"/>
+      </w:rPr>
+    </w:lvl>
+    <w:lvl w:ilvl="3" w:tentative="1">
+      <w:start w:val="1"/>
+      <w:numFmt w:val="bullet"/>
+      <w:lvlText w:val=""/>
+      <w:lvlJc w:val="left"/>
+      <w:pPr>
+        <w:tabs>
+          <w:tab w:val="num" w:pos="2880"/>
+        </w:tabs>
+        <w:ind w:left="2880" w:hanging="360"/>
+      </w:pPr>
+      <w:rPr>
+        <w:rFonts w:ascii="Wingdings" w:hAnsi="Wingdings" w:hint="default"/>
+        <w:sz w:val="20"/>
+      </w:rPr>
+    </w:lvl>
+    <w:lvl w:ilvl="4" w:tentative="1">
+      <w:start w:val="1"/>
+      <w:numFmt w:val="bullet"/>
+      <w:lvlText w:val=""/>
+      <w:lvlJc w:val="left"/>
+      <w:pPr>
+        <w:tabs>
+          <w:tab w:val="num" w:pos="3600"/>
+        </w:tabs>
+        <w:ind w:left="3600" w:hanging="360"/>
+      </w:pPr>
+      <w:rPr>
+        <w:rFonts w:ascii="Wingdings" w:hAnsi="Wingdings" w:hint="default"/>
+        <w:sz w:val="20"/>
+      </w:rPr>
+    </w:lvl>
+    <w:lvl w:ilvl="5" w:tentative="1">
+      <w:start w:val="1"/>
+      <w:numFmt w:val="bullet"/>
+      <w:lvlText w:val=""/>
+      <w:lvlJc w:val="left"/>
+      <w:pPr>
+        <w:tabs>
+          <w:tab w:val="num" w:pos="4320"/>
+        </w:tabs>
+        <w:ind w:left="4320" w:hanging="360"/>
+      </w:pPr>
+      <w:rPr>
+        <w:rFonts w:ascii="Wingdings" w:hAnsi="Wingdings" w:hint="default"/>
+        <w:sz w:val="20"/>
+      </w:rPr>
+    </w:lvl>
+    <w:lvl w:ilvl="6" w:tentative="1">
+      <w:start w:val="1"/>
+      <w:numFmt w:val="bullet"/>
+      <w:lvlText w:val=""/>
+      <w:lvlJc w:val="left"/>
+      <w:pPr>
+        <w:tabs>
+          <w:tab w:val="num" w:pos="5040"/>
+        </w:tabs>
+        <w:ind w:left="5040" w:hanging="360"/>
+      </w:pPr>
+      <w:rPr>
+        <w:rFonts w:ascii="Wingdings" w:hAnsi="Wingdings" w:hint="default"/>
+        <w:sz w:val="20"/>
+      </w:rPr>
+    </w:lvl>
+    <w:lvl w:ilvl="7" w:tentative="1">
+      <w:start w:val="1"/>
+      <w:numFmt w:val="bullet"/>
+      <w:lvlText w:val=""/>
+      <w:lvlJc w:val="left"/>
+      <w:pPr>
+        <w:tabs>
+          <w:tab w:val="num" w:pos="5760"/>
+        </w:tabs>
+        <w:ind w:left="5760" w:hanging="360"/>
+      </w:pPr>
+      <w:rPr>
+        <w:rFonts w:ascii="Wingdings" w:hAnsi="Wingdings" w:hint="default"/>
+        <w:sz w:val="20"/>
+      </w:rPr>
+    </w:lvl>
+    <w:lvl w:ilvl="8" w:tentative="1">
+      <w:start w:val="1"/>
+      <w:numFmt w:val="bullet"/>
+      <w:lvlText w:val=""/>
+      <w:lvlJc w:val="left"/>
+      <w:pPr>
+        <w:tabs>
+          <w:tab w:val="num" w:pos="6480"/>
+        </w:tabs>
+        <w:ind w:left="6480" w:hanging="360"/>
+      </w:pPr>
+      <w:rPr>
+        <w:rFonts w:ascii="Wingdings" w:hAnsi="Wingdings" w:hint="default"/>
+        <w:sz w:val="20"/>
+      </w:rPr>
+    </w:lvl>
+  </w:abstractNum>
+  <w:abstractNum w:abstractNumId="9" w15:restartNumberingAfterBreak="0">
+    <w:nsid w:val="4C297B4E"/>
+    <w:multiLevelType w:val="hybridMultilevel"/>
+    <w:tmpl w:val="5C64E394"/>
+    <w:lvl w:ilvl="0" w:tplc="A3D47A2C">
+      <w:numFmt w:val="bullet"/>
+      <w:lvlText w:val=""/>
+      <w:lvlJc w:val="left"/>
+      <w:pPr>
+        <w:ind w:left="720" w:hanging="360"/>
+      </w:pPr>
+      <w:rPr>
+        <w:rFonts w:ascii="Symbol" w:eastAsiaTheme="minorHAnsi" w:hAnsi="Symbol" w:cstheme="minorBidi" w:hint="default"/>
+      </w:rPr>
+    </w:lvl>
+    <w:lvl w:ilvl="1" w:tplc="04090003" w:tentative="1">
+      <w:start w:val="1"/>
+      <w:numFmt w:val="bullet"/>
+      <w:lvlText w:val="o"/>
+      <w:lvlJc w:val="left"/>
+      <w:pPr>
+        <w:ind w:left="1440" w:hanging="360"/>
+      </w:pPr>
+      <w:rPr>
+        <w:rFonts w:ascii="Courier New" w:hAnsi="Courier New" w:cs="Courier New" w:hint="default"/>
+      </w:rPr>
+    </w:lvl>
+    <w:lvl w:ilvl="2" w:tplc="04090005" w:tentative="1">
+      <w:start w:val="1"/>
+      <w:numFmt w:val="bullet"/>
+      <w:lvlText w:val=""/>
+      <w:lvlJc w:val="left"/>
+      <w:pPr>
+        <w:ind w:left="2160" w:hanging="360"/>
+      </w:pPr>
+      <w:rPr>
+        <w:rFonts w:ascii="Wingdings" w:hAnsi="Wingdings" w:hint="default"/>
+      </w:rPr>
+    </w:lvl>
+    <w:lvl w:ilvl="3" w:tplc="04090001" w:tentative="1">
+      <w:start w:val="1"/>
+      <w:numFmt w:val="bullet"/>
+      <w:lvlText w:val=""/>
+      <w:lvlJc w:val="left"/>
+      <w:pPr>
+        <w:ind w:left="2880" w:hanging="360"/>
+      </w:pPr>
+      <w:rPr>
+        <w:rFonts w:ascii="Symbol" w:hAnsi="Symbol" w:hint="default"/>
+      </w:rPr>
+    </w:lvl>
+    <w:lvl w:ilvl="4" w:tplc="04090003" w:tentative="1">
+      <w:start w:val="1"/>
+      <w:numFmt w:val="bullet"/>
+      <w:lvlText w:val="o"/>
+      <w:lvlJc w:val="left"/>
+      <w:pPr>
+        <w:ind w:left="3600" w:hanging="360"/>
+      </w:pPr>
+      <w:rPr>
+        <w:rFonts w:ascii="Courier New" w:hAnsi="Courier New" w:cs="Courier New" w:hint="default"/>
+      </w:rPr>
+    </w:lvl>
+    <w:lvl w:ilvl="5" w:tplc="04090005" w:tentative="1">
+      <w:start w:val="1"/>
+      <w:numFmt w:val="bullet"/>
+      <w:lvlText w:val=""/>
+      <w:lvlJc w:val="left"/>
+      <w:pPr>
+        <w:ind w:left="4320" w:hanging="360"/>
+      </w:pPr>
+      <w:rPr>
+        <w:rFonts w:ascii="Wingdings" w:hAnsi="Wingdings" w:hint="default"/>
+      </w:rPr>
+    </w:lvl>
+    <w:lvl w:ilvl="6" w:tplc="04090001" w:tentative="1">
+      <w:start w:val="1"/>
+      <w:numFmt w:val="bullet"/>
+      <w:lvlText w:val=""/>
+      <w:lvlJc w:val="left"/>
+      <w:pPr>
+        <w:ind w:left="5040" w:hanging="360"/>
+      </w:pPr>
+      <w:rPr>
+        <w:rFonts w:ascii="Symbol" w:hAnsi="Symbol" w:hint="default"/>
+      </w:rPr>
+    </w:lvl>
+    <w:lvl w:ilvl="7" w:tplc="04090003" w:tentative="1">
+      <w:start w:val="1"/>
+      <w:numFmt w:val="bullet"/>
+      <w:lvlText w:val="o"/>
+      <w:lvlJc w:val="left"/>
+      <w:pPr>
+        <w:ind w:left="5760" w:hanging="360"/>
+      </w:pPr>
+      <w:rPr>
+        <w:rFonts w:ascii="Courier New" w:hAnsi="Courier New" w:cs="Courier New" w:hint="default"/>
+      </w:rPr>
+    </w:lvl>
+    <w:lvl w:ilvl="8" w:tplc="04090005" w:tentative="1">
+      <w:start w:val="1"/>
+      <w:numFmt w:val="bullet"/>
+      <w:lvlText w:val=""/>
+      <w:lvlJc w:val="left"/>
+      <w:pPr>
+        <w:ind w:left="6480" w:hanging="360"/>
+      </w:pPr>
+      <w:rPr>
+        <w:rFonts w:ascii="Wingdings" w:hAnsi="Wingdings" w:hint="default"/>
+      </w:rPr>
+    </w:lvl>
+  </w:abstractNum>
+  <w:abstractNum w:abstractNumId="10" w15:restartNumberingAfterBreak="0">
+    <w:nsid w:val="4DB27BF0"/>
+    <w:multiLevelType w:val="multilevel"/>
+    <w:tmpl w:val="E6C21CEC"/>
+    <w:lvl w:ilvl="0">
+      <w:start w:val="1"/>
+      <w:numFmt w:val="bullet"/>
+      <w:lvlText w:val=""/>
+      <w:lvlJc w:val="left"/>
+      <w:pPr>
+        <w:tabs>
+          <w:tab w:val="num" w:pos="720"/>
+        </w:tabs>
+        <w:ind w:left="720" w:hanging="360"/>
+      </w:pPr>
+      <w:rPr>
+        <w:rFonts w:ascii="Symbol" w:hAnsi="Symbol" w:hint="default"/>
+        <w:sz w:val="20"/>
+      </w:rPr>
+    </w:lvl>
+    <w:lvl w:ilvl="1" w:tentative="1">
+      <w:start w:val="1"/>
+      <w:numFmt w:val="bullet"/>
+      <w:lvlText w:val="o"/>
+      <w:lvlJc w:val="left"/>
+      <w:pPr>
+        <w:tabs>
+          <w:tab w:val="num" w:pos="1440"/>
+        </w:tabs>
+        <w:ind w:left="1440" w:hanging="360"/>
+      </w:pPr>
+      <w:rPr>
+        <w:rFonts w:ascii="Courier New" w:hAnsi="Courier New" w:hint="default"/>
+        <w:sz w:val="20"/>
+      </w:rPr>
+    </w:lvl>
+    <w:lvl w:ilvl="2" w:tentative="1">
+      <w:start w:val="1"/>
+      <w:numFmt w:val="bullet"/>
+      <w:lvlText w:val=""/>
+      <w:lvlJc w:val="left"/>
+      <w:pPr>
+        <w:tabs>
+          <w:tab w:val="num" w:pos="2160"/>
+        </w:tabs>
+        <w:ind w:left="2160" w:hanging="360"/>
+      </w:pPr>
+      <w:rPr>
+        <w:rFonts w:ascii="Wingdings" w:hAnsi="Wingdings" w:hint="default"/>
+        <w:sz w:val="20"/>
+      </w:rPr>
+    </w:lvl>
+    <w:lvl w:ilvl="3" w:tentative="1">
+      <w:start w:val="1"/>
+      <w:numFmt w:val="bullet"/>
+      <w:lvlText w:val=""/>
+      <w:lvlJc w:val="left"/>
+      <w:pPr>
+        <w:tabs>
+          <w:tab w:val="num" w:pos="2880"/>
+        </w:tabs>
+        <w:ind w:left="2880" w:hanging="360"/>
+      </w:pPr>
+      <w:rPr>
+        <w:rFonts w:ascii="Wingdings" w:hAnsi="Wingdings" w:hint="default"/>
+        <w:sz w:val="20"/>
+      </w:rPr>
+    </w:lvl>
+    <w:lvl w:ilvl="4" w:tentative="1">
+      <w:start w:val="1"/>
+      <w:numFmt w:val="bullet"/>
+      <w:lvlText w:val=""/>
+      <w:lvlJc w:val="left"/>
+      <w:pPr>
+        <w:tabs>
+          <w:tab w:val="num" w:pos="3600"/>
+        </w:tabs>
+        <w:ind w:left="3600" w:hanging="360"/>
+      </w:pPr>
+      <w:rPr>
+        <w:rFonts w:ascii="Wingdings" w:hAnsi="Wingdings" w:hint="default"/>
+        <w:sz w:val="20"/>
+      </w:rPr>
+    </w:lvl>
+    <w:lvl w:ilvl="5" w:tentative="1">
+      <w:start w:val="1"/>
+      <w:numFmt w:val="bullet"/>
+      <w:lvlText w:val=""/>
+      <w:lvlJc w:val="left"/>
+      <w:pPr>
+        <w:tabs>
+          <w:tab w:val="num" w:pos="4320"/>
+        </w:tabs>
+        <w:ind w:left="4320" w:hanging="360"/>
+      </w:pPr>
+      <w:rPr>
+        <w:rFonts w:ascii="Wingdings" w:hAnsi="Wingdings" w:hint="default"/>
+        <w:sz w:val="20"/>
+      </w:rPr>
+    </w:lvl>
+    <w:lvl w:ilvl="6" w:tentative="1">
+      <w:start w:val="1"/>
+      <w:numFmt w:val="bullet"/>
+      <w:lvlText w:val=""/>
+      <w:lvlJc w:val="left"/>
+      <w:pPr>
+        <w:tabs>
+          <w:tab w:val="num" w:pos="5040"/>
+        </w:tabs>
+        <w:ind w:left="5040" w:hanging="360"/>
+      </w:pPr>
+      <w:rPr>
+        <w:rFonts w:ascii="Wingdings" w:hAnsi="Wingdings" w:hint="default"/>
+        <w:sz w:val="20"/>
+      </w:rPr>
+    </w:lvl>
+    <w:lvl w:ilvl="7" w:tentative="1">
+      <w:start w:val="1"/>
+      <w:numFmt w:val="bullet"/>
+      <w:lvlText w:val=""/>
+      <w:lvlJc w:val="left"/>
+      <w:pPr>
+        <w:tabs>
+          <w:tab w:val="num" w:pos="5760"/>
+        </w:tabs>
+        <w:ind w:left="5760" w:hanging="360"/>
+      </w:pPr>
+      <w:rPr>
+        <w:rFonts w:ascii="Wingdings" w:hAnsi="Wingdings" w:hint="default"/>
+        <w:sz w:val="20"/>
+      </w:rPr>
+    </w:lvl>
+    <w:lvl w:ilvl="8" w:tentative="1">
+      <w:start w:val="1"/>
+      <w:numFmt w:val="bullet"/>
+      <w:lvlText w:val=""/>
+      <w:lvlJc w:val="left"/>
+      <w:pPr>
+        <w:tabs>
+          <w:tab w:val="num" w:pos="6480"/>
+        </w:tabs>
+        <w:ind w:left="6480" w:hanging="360"/>
+      </w:pPr>
+      <w:rPr>
+        <w:rFonts w:ascii="Wingdings" w:hAnsi="Wingdings" w:hint="default"/>
+        <w:sz w:val="20"/>
+      </w:rPr>
+    </w:lvl>
+  </w:abstractNum>
+  <w:abstractNum w:abstractNumId="11" w15:restartNumberingAfterBreak="0">
     <w:nsid w:val="746757FB"/>
     <w:multiLevelType w:val="hybridMultilevel"/>
     <w:tmpl w:val="E09A01C8"/>
@@ -2784,17 +5538,308 @@
       </w:rPr>
     </w:lvl>
   </w:abstractNum>
+  <w:abstractNum w:abstractNumId="12" w15:restartNumberingAfterBreak="0">
+    <w:nsid w:val="74F40A2A"/>
+    <w:multiLevelType w:val="hybridMultilevel"/>
+    <w:tmpl w:val="C9566C4A"/>
+    <w:lvl w:ilvl="0" w:tplc="8B56C32A">
+      <w:numFmt w:val="bullet"/>
+      <w:lvlText w:val="-"/>
+      <w:lvlJc w:val="left"/>
+      <w:pPr>
+        <w:ind w:left="720" w:hanging="360"/>
+      </w:pPr>
+      <w:rPr>
+        <w:rFonts w:ascii="Aptos" w:eastAsiaTheme="minorHAnsi" w:hAnsi="Aptos" w:cstheme="minorBidi" w:hint="default"/>
+      </w:rPr>
+    </w:lvl>
+    <w:lvl w:ilvl="1" w:tplc="04090003" w:tentative="1">
+      <w:start w:val="1"/>
+      <w:numFmt w:val="bullet"/>
+      <w:lvlText w:val="o"/>
+      <w:lvlJc w:val="left"/>
+      <w:pPr>
+        <w:ind w:left="1440" w:hanging="360"/>
+      </w:pPr>
+      <w:rPr>
+        <w:rFonts w:ascii="Courier New" w:hAnsi="Courier New" w:cs="Courier New" w:hint="default"/>
+      </w:rPr>
+    </w:lvl>
+    <w:lvl w:ilvl="2" w:tplc="04090005" w:tentative="1">
+      <w:start w:val="1"/>
+      <w:numFmt w:val="bullet"/>
+      <w:lvlText w:val=""/>
+      <w:lvlJc w:val="left"/>
+      <w:pPr>
+        <w:ind w:left="2160" w:hanging="360"/>
+      </w:pPr>
+      <w:rPr>
+        <w:rFonts w:ascii="Wingdings" w:hAnsi="Wingdings" w:hint="default"/>
+      </w:rPr>
+    </w:lvl>
+    <w:lvl w:ilvl="3" w:tplc="04090001" w:tentative="1">
+      <w:start w:val="1"/>
+      <w:numFmt w:val="bullet"/>
+      <w:lvlText w:val=""/>
+      <w:lvlJc w:val="left"/>
+      <w:pPr>
+        <w:ind w:left="2880" w:hanging="360"/>
+      </w:pPr>
+      <w:rPr>
+        <w:rFonts w:ascii="Symbol" w:hAnsi="Symbol" w:hint="default"/>
+      </w:rPr>
+    </w:lvl>
+    <w:lvl w:ilvl="4" w:tplc="04090003" w:tentative="1">
+      <w:start w:val="1"/>
+      <w:numFmt w:val="bullet"/>
+      <w:lvlText w:val="o"/>
+      <w:lvlJc w:val="left"/>
+      <w:pPr>
+        <w:ind w:left="3600" w:hanging="360"/>
+      </w:pPr>
+      <w:rPr>
+        <w:rFonts w:ascii="Courier New" w:hAnsi="Courier New" w:cs="Courier New" w:hint="default"/>
+      </w:rPr>
+    </w:lvl>
+    <w:lvl w:ilvl="5" w:tplc="04090005" w:tentative="1">
+      <w:start w:val="1"/>
+      <w:numFmt w:val="bullet"/>
+      <w:lvlText w:val=""/>
+      <w:lvlJc w:val="left"/>
+      <w:pPr>
+        <w:ind w:left="4320" w:hanging="360"/>
+      </w:pPr>
+      <w:rPr>
+        <w:rFonts w:ascii="Wingdings" w:hAnsi="Wingdings" w:hint="default"/>
+      </w:rPr>
+    </w:lvl>
+    <w:lvl w:ilvl="6" w:tplc="04090001" w:tentative="1">
+      <w:start w:val="1"/>
+      <w:numFmt w:val="bullet"/>
+      <w:lvlText w:val=""/>
+      <w:lvlJc w:val="left"/>
+      <w:pPr>
+        <w:ind w:left="5040" w:hanging="360"/>
+      </w:pPr>
+      <w:rPr>
+        <w:rFonts w:ascii="Symbol" w:hAnsi="Symbol" w:hint="default"/>
+      </w:rPr>
+    </w:lvl>
+    <w:lvl w:ilvl="7" w:tplc="04090003" w:tentative="1">
+      <w:start w:val="1"/>
+      <w:numFmt w:val="bullet"/>
+      <w:lvlText w:val="o"/>
+      <w:lvlJc w:val="left"/>
+      <w:pPr>
+        <w:ind w:left="5760" w:hanging="360"/>
+      </w:pPr>
+      <w:rPr>
+        <w:rFonts w:ascii="Courier New" w:hAnsi="Courier New" w:cs="Courier New" w:hint="default"/>
+      </w:rPr>
+    </w:lvl>
+    <w:lvl w:ilvl="8" w:tplc="04090005" w:tentative="1">
+      <w:start w:val="1"/>
+      <w:numFmt w:val="bullet"/>
+      <w:lvlText w:val=""/>
+      <w:lvlJc w:val="left"/>
+      <w:pPr>
+        <w:ind w:left="6480" w:hanging="360"/>
+      </w:pPr>
+      <w:rPr>
+        <w:rFonts w:ascii="Wingdings" w:hAnsi="Wingdings" w:hint="default"/>
+      </w:rPr>
+    </w:lvl>
+  </w:abstractNum>
+  <w:abstractNum w:abstractNumId="13" w15:restartNumberingAfterBreak="0">
+    <w:nsid w:val="7A515A6C"/>
+    <w:multiLevelType w:val="multilevel"/>
+    <w:tmpl w:val="737E3F46"/>
+    <w:lvl w:ilvl="0">
+      <w:start w:val="1"/>
+      <w:numFmt w:val="bullet"/>
+      <w:lvlText w:val=""/>
+      <w:lvlJc w:val="left"/>
+      <w:pPr>
+        <w:tabs>
+          <w:tab w:val="num" w:pos="720"/>
+        </w:tabs>
+        <w:ind w:left="720" w:hanging="360"/>
+      </w:pPr>
+      <w:rPr>
+        <w:rFonts w:ascii="Symbol" w:hAnsi="Symbol" w:hint="default"/>
+        <w:sz w:val="20"/>
+      </w:rPr>
+    </w:lvl>
+    <w:lvl w:ilvl="1" w:tentative="1">
+      <w:start w:val="1"/>
+      <w:numFmt w:val="bullet"/>
+      <w:lvlText w:val="o"/>
+      <w:lvlJc w:val="left"/>
+      <w:pPr>
+        <w:tabs>
+          <w:tab w:val="num" w:pos="1440"/>
+        </w:tabs>
+        <w:ind w:left="1440" w:hanging="360"/>
+      </w:pPr>
+      <w:rPr>
+        <w:rFonts w:ascii="Courier New" w:hAnsi="Courier New" w:hint="default"/>
+        <w:sz w:val="20"/>
+      </w:rPr>
+    </w:lvl>
+    <w:lvl w:ilvl="2" w:tentative="1">
+      <w:start w:val="1"/>
+      <w:numFmt w:val="bullet"/>
+      <w:lvlText w:val=""/>
+      <w:lvlJc w:val="left"/>
+      <w:pPr>
+        <w:tabs>
+          <w:tab w:val="num" w:pos="2160"/>
+        </w:tabs>
+        <w:ind w:left="2160" w:hanging="360"/>
+      </w:pPr>
+      <w:rPr>
+        <w:rFonts w:ascii="Wingdings" w:hAnsi="Wingdings" w:hint="default"/>
+        <w:sz w:val="20"/>
+      </w:rPr>
+    </w:lvl>
+    <w:lvl w:ilvl="3" w:tentative="1">
+      <w:start w:val="1"/>
+      <w:numFmt w:val="bullet"/>
+      <w:lvlText w:val=""/>
+      <w:lvlJc w:val="left"/>
+      <w:pPr>
+        <w:tabs>
+          <w:tab w:val="num" w:pos="2880"/>
+        </w:tabs>
+        <w:ind w:left="2880" w:hanging="360"/>
+      </w:pPr>
+      <w:rPr>
+        <w:rFonts w:ascii="Wingdings" w:hAnsi="Wingdings" w:hint="default"/>
+        <w:sz w:val="20"/>
+      </w:rPr>
+    </w:lvl>
+    <w:lvl w:ilvl="4" w:tentative="1">
+      <w:start w:val="1"/>
+      <w:numFmt w:val="bullet"/>
+      <w:lvlText w:val=""/>
+      <w:lvlJc w:val="left"/>
+      <w:pPr>
+        <w:tabs>
+          <w:tab w:val="num" w:pos="3600"/>
+        </w:tabs>
+        <w:ind w:left="3600" w:hanging="360"/>
+      </w:pPr>
+      <w:rPr>
+        <w:rFonts w:ascii="Wingdings" w:hAnsi="Wingdings" w:hint="default"/>
+        <w:sz w:val="20"/>
+      </w:rPr>
+    </w:lvl>
+    <w:lvl w:ilvl="5" w:tentative="1">
+      <w:start w:val="1"/>
+      <w:numFmt w:val="bullet"/>
+      <w:lvlText w:val=""/>
+      <w:lvlJc w:val="left"/>
+      <w:pPr>
+        <w:tabs>
+          <w:tab w:val="num" w:pos="4320"/>
+        </w:tabs>
+        <w:ind w:left="4320" w:hanging="360"/>
+      </w:pPr>
+      <w:rPr>
+        <w:rFonts w:ascii="Wingdings" w:hAnsi="Wingdings" w:hint="default"/>
+        <w:sz w:val="20"/>
+      </w:rPr>
+    </w:lvl>
+    <w:lvl w:ilvl="6" w:tentative="1">
+      <w:start w:val="1"/>
+      <w:numFmt w:val="bullet"/>
+      <w:lvlText w:val=""/>
+      <w:lvlJc w:val="left"/>
+      <w:pPr>
+        <w:tabs>
+          <w:tab w:val="num" w:pos="5040"/>
+        </w:tabs>
+        <w:ind w:left="5040" w:hanging="360"/>
+      </w:pPr>
+      <w:rPr>
+        <w:rFonts w:ascii="Wingdings" w:hAnsi="Wingdings" w:hint="default"/>
+        <w:sz w:val="20"/>
+      </w:rPr>
+    </w:lvl>
+    <w:lvl w:ilvl="7" w:tentative="1">
+      <w:start w:val="1"/>
+      <w:numFmt w:val="bullet"/>
+      <w:lvlText w:val=""/>
+      <w:lvlJc w:val="left"/>
+      <w:pPr>
+        <w:tabs>
+          <w:tab w:val="num" w:pos="5760"/>
+        </w:tabs>
+        <w:ind w:left="5760" w:hanging="360"/>
+      </w:pPr>
+      <w:rPr>
+        <w:rFonts w:ascii="Wingdings" w:hAnsi="Wingdings" w:hint="default"/>
+        <w:sz w:val="20"/>
+      </w:rPr>
+    </w:lvl>
+    <w:lvl w:ilvl="8" w:tentative="1">
+      <w:start w:val="1"/>
+      <w:numFmt w:val="bullet"/>
+      <w:lvlText w:val=""/>
+      <w:lvlJc w:val="left"/>
+      <w:pPr>
+        <w:tabs>
+          <w:tab w:val="num" w:pos="6480"/>
+        </w:tabs>
+        <w:ind w:left="6480" w:hanging="360"/>
+      </w:pPr>
+      <w:rPr>
+        <w:rFonts w:ascii="Wingdings" w:hAnsi="Wingdings" w:hint="default"/>
+        <w:sz w:val="20"/>
+      </w:rPr>
+    </w:lvl>
+  </w:abstractNum>
   <w:num w:numId="1" w16cid:durableId="645554869">
+    <w:abstractNumId w:val="5"/>
+  </w:num>
+  <w:num w:numId="2" w16cid:durableId="1204755911">
+    <w:abstractNumId w:val="7"/>
+  </w:num>
+  <w:num w:numId="3" w16cid:durableId="1647472037">
+    <w:abstractNumId w:val="4"/>
+  </w:num>
+  <w:num w:numId="4" w16cid:durableId="1419903327">
+    <w:abstractNumId w:val="11"/>
+  </w:num>
+  <w:num w:numId="5" w16cid:durableId="2030567718">
+    <w:abstractNumId w:val="10"/>
+  </w:num>
+  <w:num w:numId="6" w16cid:durableId="994265090">
+    <w:abstractNumId w:val="8"/>
+  </w:num>
+  <w:num w:numId="7" w16cid:durableId="1473015007">
+    <w:abstractNumId w:val="6"/>
+  </w:num>
+  <w:num w:numId="8" w16cid:durableId="1670713318">
+    <w:abstractNumId w:val="13"/>
+  </w:num>
+  <w:num w:numId="9" w16cid:durableId="1881432096">
+    <w:abstractNumId w:val="2"/>
+  </w:num>
+  <w:num w:numId="10" w16cid:durableId="1358309263">
+    <w:abstractNumId w:val="12"/>
+  </w:num>
+  <w:num w:numId="11" w16cid:durableId="1537808666">
+    <w:abstractNumId w:val="0"/>
+  </w:num>
+  <w:num w:numId="12" w16cid:durableId="1593246239">
     <w:abstractNumId w:val="1"/>
   </w:num>
-  <w:num w:numId="2" w16cid:durableId="1204755911">
-    <w:abstractNumId w:val="2"/>
+  <w:num w:numId="13" w16cid:durableId="1859347979">
+    <w:abstractNumId w:val="3"/>
   </w:num>
-  <w:num w:numId="3" w16cid:durableId="1647472037">
-    <w:abstractNumId w:val="0"/>
-  </w:num>
-  <w:num w:numId="4" w16cid:durableId="1419903327">
-    <w:abstractNumId w:val="3"/>
+  <w:num w:numId="14" w16cid:durableId="6374556">
+    <w:abstractNumId w:val="9"/>
   </w:num>
 </w:numbering>
 </file>
@@ -3782,6 +6827,87 @@
       <w:szCs w:val="20"/>
     </w:rPr>
   </w:style>
+  <w:style w:type="character" w:styleId="Strong">
+    <w:name w:val="Strong"/>
+    <w:basedOn w:val="DefaultParagraphFont"/>
+    <w:uiPriority w:val="22"/>
+    <w:qFormat/>
+    <w:rsid w:val="00341685"/>
+    <w:rPr>
+      <w:b/>
+      <w:bCs/>
+    </w:rPr>
+  </w:style>
+  <w:style w:type="character" w:styleId="HTMLCode">
+    <w:name w:val="HTML Code"/>
+    <w:basedOn w:val="DefaultParagraphFont"/>
+    <w:uiPriority w:val="99"/>
+    <w:semiHidden/>
+    <w:unhideWhenUsed/>
+    <w:rsid w:val="00341685"/>
+    <w:rPr>
+      <w:rFonts w:ascii="Courier New" w:eastAsia="Times New Roman" w:hAnsi="Courier New" w:cs="Courier New"/>
+      <w:sz w:val="20"/>
+      <w:szCs w:val="20"/>
+    </w:rPr>
+  </w:style>
+  <w:style w:type="paragraph" w:styleId="NormalWeb">
+    <w:name w:val="Normal (Web)"/>
+    <w:basedOn w:val="Normal"/>
+    <w:uiPriority w:val="99"/>
+    <w:unhideWhenUsed/>
+    <w:rsid w:val="00341685"/>
+    <w:pPr>
+      <w:spacing w:before="100" w:beforeAutospacing="1" w:after="100" w:afterAutospacing="1" w:line="240" w:lineRule="auto"/>
+    </w:pPr>
+    <w:rPr>
+      <w:rFonts w:ascii="Times New Roman" w:eastAsia="Times New Roman" w:hAnsi="Times New Roman" w:cs="Times New Roman"/>
+      <w:kern w:val="0"/>
+      <w:sz w:val="24"/>
+      <w:szCs w:val="24"/>
+      <w14:ligatures w14:val="none"/>
+    </w:rPr>
+  </w:style>
+  <w:style w:type="character" w:styleId="Hyperlink">
+    <w:name w:val="Hyperlink"/>
+    <w:basedOn w:val="DefaultParagraphFont"/>
+    <w:uiPriority w:val="99"/>
+    <w:unhideWhenUsed/>
+    <w:rsid w:val="00BD2AF9"/>
+    <w:rPr>
+      <w:color w:val="467886" w:themeColor="hyperlink"/>
+      <w:u w:val="single"/>
+    </w:rPr>
+  </w:style>
+  <w:style w:type="character" w:styleId="UnresolvedMention">
+    <w:name w:val="Unresolved Mention"/>
+    <w:basedOn w:val="DefaultParagraphFont"/>
+    <w:uiPriority w:val="99"/>
+    <w:semiHidden/>
+    <w:unhideWhenUsed/>
+    <w:rsid w:val="00BD2AF9"/>
+    <w:rPr>
+      <w:color w:val="605E5C"/>
+      <w:shd w:val="clear" w:color="auto" w:fill="E1DFDD"/>
+    </w:rPr>
+  </w:style>
+  <w:style w:type="character" w:customStyle="1" w:styleId="font-semibold">
+    <w:name w:val="font-semibold"/>
+    <w:basedOn w:val="DefaultParagraphFont"/>
+    <w:rsid w:val="008A4C6F"/>
+  </w:style>
+  <w:style w:type="character" w:styleId="FollowedHyperlink">
+    <w:name w:val="FollowedHyperlink"/>
+    <w:basedOn w:val="DefaultParagraphFont"/>
+    <w:uiPriority w:val="99"/>
+    <w:semiHidden/>
+    <w:unhideWhenUsed/>
+    <w:rsid w:val="009D2C43"/>
+    <w:rPr>
+      <w:color w:val="96607D" w:themeColor="followedHyperlink"/>
+      <w:u w:val="single"/>
+    </w:rPr>
+  </w:style>
 </w:styles>
 </file>
 

</xml_diff>